<commit_message>
A LITTLE CHANGE IN PAPER
ADDED DOI LINK
</commit_message>
<xml_diff>
--- a/paper/Analysis.docx
+++ b/paper/Analysis.docx
@@ -3391,7 +3391,7 @@
         </w:rPr>
         <w:lastRenderedPageBreak/>
         <w:drawing>
-          <wp:inline distT="0" distB="0" distL="0" distR="0" wp14:anchorId="7616F749" wp14:editId="3DC46AA0">
+          <wp:inline distT="0" distB="0" distL="0" distR="0" wp14:anchorId="7616F749" wp14:editId="0FEA5092">
             <wp:extent cx="4267200" cy="3200636"/>
             <wp:effectExtent l="0" t="0" r="0" b="0"/>
             <wp:docPr id="1029293278" name="Picture 1"/>
@@ -8269,11 +8269,6 @@
     <w:p>
       <w:pPr>
         <w:rPr>
-          <w:rFonts w:ascii="CMU Serif" w:hAnsi="CMU Serif" w:cs="CMU Serif"/>
-          <w:b/>
-          <w:bCs/>
-          <w:sz w:val="24"/>
-          <w:szCs w:val="24"/>
           <w:lang w:val="en-US"/>
         </w:rPr>
       </w:pPr>
@@ -8286,27 +8281,28 @@
             <w:szCs w:val="24"/>
             <w:lang w:val="en-US"/>
           </w:rPr>
-          <w:t>https://github.com/ritaell/alzheimers-transcriptomic-</w:t>
+          <w:t>https://github.com/ritaell/alzheimers-transcriptomic-analysis</w:t>
         </w:r>
+      </w:hyperlink>
+    </w:p>
+    <w:p>
+      <w:pPr>
+        <w:rPr>
+          <w:rFonts w:ascii="CMU Serif" w:hAnsi="CMU Serif" w:cs="CMU Serif"/>
+          <w:sz w:val="24"/>
+          <w:szCs w:val="24"/>
+          <w:lang w:val="en-US"/>
+        </w:rPr>
+      </w:pPr>
+      <w:hyperlink r:id="rId17" w:history="1">
         <w:r>
           <w:rPr>
             <w:rStyle w:val="Hyperlink"/>
             <w:rFonts w:ascii="CMU Serif" w:hAnsi="CMU Serif" w:cs="CMU Serif"/>
             <w:sz w:val="24"/>
             <w:szCs w:val="24"/>
-            <w:lang w:val="en-US"/>
           </w:rPr>
-          <w:t>a</w:t>
-        </w:r>
-        <w:r>
-          <w:rPr>
-            <w:rStyle w:val="Hyperlink"/>
-            <w:rFonts w:ascii="CMU Serif" w:hAnsi="CMU Serif" w:cs="CMU Serif"/>
-            <w:sz w:val="24"/>
-            <w:szCs w:val="24"/>
-            <w:lang w:val="en-US"/>
-          </w:rPr>
-          <w:t>nalysis</w:t>
+          <w:t> DOI: 10.5281/zenodo.21198586</w:t>
         </w:r>
       </w:hyperlink>
     </w:p>
@@ -8368,7 +8364,7 @@
         </w:rPr>
         <w:t xml:space="preserve">, 25(1), 25–29. </w:t>
       </w:r>
-      <w:hyperlink r:id="rId17" w:history="1">
+      <w:hyperlink r:id="rId18" w:history="1">
         <w:r>
           <w:rPr>
             <w:rStyle w:val="Hyperlink"/>
@@ -8419,7 +8415,7 @@
         </w:rPr>
         <w:t xml:space="preserve">, 57(1), 289–300. </w:t>
       </w:r>
-      <w:hyperlink r:id="rId18" w:history="1">
+      <w:hyperlink r:id="rId19" w:history="1">
         <w:r>
           <w:rPr>
             <w:rStyle w:val="Hyperlink"/>
@@ -8510,7 +8506,7 @@
         </w:rPr>
         <w:t xml:space="preserve">, 14, 128. </w:t>
       </w:r>
-      <w:hyperlink r:id="rId19" w:history="1">
+      <w:hyperlink r:id="rId20" w:history="1">
         <w:r>
           <w:rPr>
             <w:rStyle w:val="Hyperlink"/>
@@ -8539,6 +8535,7 @@
           <w:szCs w:val="24"/>
           <w:lang w:val="en-US"/>
         </w:rPr>
+        <w:lastRenderedPageBreak/>
         <w:t xml:space="preserve">[4] Edgar, R., Domrachev, M., &amp; Lash, A. E. (2002). Gene Expression Omnibus: NCBI gene expression and hybridization array data repository. </w:t>
       </w:r>
       <w:r>
@@ -8561,7 +8558,7 @@
         </w:rPr>
         <w:t xml:space="preserve">, 30(1), 207–210. </w:t>
       </w:r>
-      <w:hyperlink r:id="rId20" w:history="1">
+      <w:hyperlink r:id="rId21" w:history="1">
         <w:r>
           <w:rPr>
             <w:rStyle w:val="Hyperlink"/>
@@ -8590,7 +8587,6 @@
           <w:szCs w:val="24"/>
           <w:lang w:val="en-US"/>
         </w:rPr>
-        <w:lastRenderedPageBreak/>
         <w:t xml:space="preserve">[5] Fang, Z., Liu, X., &amp; Peltz, G. (2023). </w:t>
       </w:r>
       <w:proofErr w:type="spellStart"/>
@@ -8633,7 +8629,7 @@
         </w:rPr>
         <w:t xml:space="preserve">, 39(1). </w:t>
       </w:r>
-      <w:hyperlink r:id="rId21" w:history="1">
+      <w:hyperlink r:id="rId22" w:history="1">
         <w:r>
           <w:rPr>
             <w:rStyle w:val="Hyperlink"/>
@@ -8724,7 +8720,7 @@
         </w:rPr>
         <w:t xml:space="preserve">, 51(D1), D587–D592. </w:t>
       </w:r>
-      <w:hyperlink r:id="rId22" w:history="1">
+      <w:hyperlink r:id="rId23" w:history="1">
         <w:r>
           <w:rPr>
             <w:rStyle w:val="Hyperlink"/>
@@ -8855,7 +8851,7 @@
         </w:rPr>
         <w:t xml:space="preserve">, 7(3), 263–269. </w:t>
       </w:r>
-      <w:hyperlink r:id="rId23" w:history="1">
+      <w:hyperlink r:id="rId24" w:history="1">
         <w:r>
           <w:rPr>
             <w:rStyle w:val="Hyperlink"/>
@@ -8965,7 +8961,7 @@
         </w:rPr>
         <w:t xml:space="preserve">, 10, 743. </w:t>
       </w:r>
-      <w:hyperlink r:id="rId24" w:history="1">
+      <w:hyperlink r:id="rId25" w:history="1">
         <w:r>
           <w:rPr>
             <w:rStyle w:val="Hyperlink"/>
@@ -9155,7 +9151,7 @@
         </w:rPr>
         <w:t xml:space="preserve">, 43(7), e47. </w:t>
       </w:r>
-      <w:hyperlink r:id="rId25" w:history="1">
+      <w:hyperlink r:id="rId26" w:history="1">
         <w:r>
           <w:rPr>
             <w:rStyle w:val="Hyperlink"/>
@@ -9206,7 +9202,7 @@
         </w:rPr>
         <w:t xml:space="preserve">, 3(1). </w:t>
       </w:r>
-      <w:hyperlink r:id="rId26" w:history="1">
+      <w:hyperlink r:id="rId27" w:history="1">
         <w:r>
           <w:rPr>
             <w:rStyle w:val="Hyperlink"/>
@@ -9337,7 +9333,7 @@
         </w:rPr>
         <w:t xml:space="preserve">, 51(D1), D638–D646. </w:t>
       </w:r>
-      <w:hyperlink r:id="rId27" w:history="1">
+      <w:hyperlink r:id="rId28" w:history="1">
         <w:r>
           <w:rPr>
             <w:rStyle w:val="Hyperlink"/>
@@ -9366,6 +9362,7 @@
           <w:szCs w:val="24"/>
           <w:lang w:val="en-US"/>
         </w:rPr>
+        <w:lastRenderedPageBreak/>
         <w:t xml:space="preserve">[14] The Gene Ontology Consortium. (2023). The Gene Ontology knowledgebase: 2023 update. </w:t>
       </w:r>
       <w:r>
@@ -9388,7 +9385,7 @@
         </w:rPr>
         <w:t xml:space="preserve">, 51(D1), D849–D856. </w:t>
       </w:r>
-      <w:hyperlink r:id="rId28" w:history="1">
+      <w:hyperlink r:id="rId29" w:history="1">
         <w:r>
           <w:rPr>
             <w:rStyle w:val="Hyperlink"/>
@@ -9419,7 +9416,7 @@
         </w:rPr>
         <w:t xml:space="preserve">[15] Van Rossum, G., &amp; Drake, F. L. (2009). Python 3 Reference Manual. Python Software Foundation. </w:t>
       </w:r>
-      <w:hyperlink r:id="rId29" w:history="1">
+      <w:hyperlink r:id="rId30" w:history="1">
         <w:r>
           <w:rPr>
             <w:rStyle w:val="Hyperlink"/>
@@ -9448,7 +9445,6 @@
           <w:szCs w:val="24"/>
           <w:lang w:val="en-US"/>
         </w:rPr>
-        <w:lastRenderedPageBreak/>
         <w:t xml:space="preserve">[16] Hagberg, A. A., Schult, D. A., &amp; Swart, P. J. (2008). Exploring network structure, dynamics, and function using </w:t>
       </w:r>
       <w:proofErr w:type="spellStart"/>
@@ -9510,7 +9506,7 @@
         </w:rPr>
         <w:t xml:space="preserve">[17] World Health Organization. (2023). Dementia. </w:t>
       </w:r>
-      <w:hyperlink r:id="rId30" w:history="1">
+      <w:hyperlink r:id="rId31" w:history="1">
         <w:r>
           <w:rPr>
             <w:rStyle w:val="Hyperlink"/>
@@ -9617,7 +9613,7 @@
         </w:rPr>
         <w:t xml:space="preserve">GitHub. </w:t>
       </w:r>
-      <w:hyperlink r:id="rId31" w:history="1">
+      <w:hyperlink r:id="rId32" w:history="1">
         <w:r>
           <w:rPr>
             <w:rStyle w:val="Hyperlink"/>
@@ -9627,6 +9623,35 @@
             <w:lang w:val="en-US"/>
           </w:rPr>
           <w:t>https://github.com/ritaell/alzheimers-transcriptomic-analysis</w:t>
+        </w:r>
+      </w:hyperlink>
+      <w:r>
+        <w:rPr>
+          <w:lang w:val="en-US"/>
+        </w:rPr>
+        <w:t xml:space="preserve">, DOI: </w:t>
+      </w:r>
+      <w:hyperlink r:id="rId33" w:history="1">
+        <w:r>
+          <w:rPr>
+            <w:rStyle w:val="Hyperlink"/>
+            <w:lang w:val="en-US"/>
+          </w:rPr>
+          <w:t> D</w:t>
+        </w:r>
+        <w:r>
+          <w:rPr>
+            <w:rStyle w:val="Hyperlink"/>
+            <w:lang w:val="en-US"/>
+          </w:rPr>
+          <w:t>O</w:t>
+        </w:r>
+        <w:r>
+          <w:rPr>
+            <w:rStyle w:val="Hyperlink"/>
+            <w:lang w:val="en-US"/>
+          </w:rPr>
+          <w:t>I: 10.5281/zenodo.21198586</w:t>
         </w:r>
       </w:hyperlink>
     </w:p>
@@ -11171,7 +11196,6 @@
   <w:style w:type="character" w:default="1" w:styleId="DefaultParagraphFont">
     <w:name w:val="Default Paragraph Font"/>
     <w:uiPriority w:val="1"/>
-    <w:semiHidden/>
     <w:unhideWhenUsed/>
   </w:style>
   <w:style w:type="table" w:default="1" w:styleId="TableNormal">

</xml_diff>

<commit_message>
final check on the paper
</commit_message>
<xml_diff>
--- a/paper/Analysis.docx
+++ b/paper/Analysis.docx
@@ -3391,9 +3391,9 @@
         </w:rPr>
         <w:lastRenderedPageBreak/>
         <w:drawing>
-          <wp:inline distT="0" distB="0" distL="0" distR="0" wp14:anchorId="7616F749" wp14:editId="0FEA5092">
-            <wp:extent cx="4267200" cy="3200636"/>
-            <wp:effectExtent l="0" t="0" r="0" b="0"/>
+          <wp:inline distT="0" distB="0" distL="0" distR="0" wp14:anchorId="7616F749" wp14:editId="2688396F">
+            <wp:extent cx="5041528" cy="3781425"/>
+            <wp:effectExtent l="0" t="0" r="6985" b="0"/>
             <wp:docPr id="1029293278" name="Picture 1"/>
             <wp:cNvGraphicFramePr>
               <a:graphicFrameLocks xmlns:a="http://schemas.openxmlformats.org/drawingml/2006/main" noChangeAspect="1"/>
@@ -3420,7 +3420,7 @@
                   <pic:spPr>
                     <a:xfrm>
                       <a:off x="0" y="0"/>
-                      <a:ext cx="4279835" cy="3210113"/>
+                      <a:ext cx="5059137" cy="3794633"/>
                     </a:xfrm>
                     <a:prstGeom prst="rect">
                       <a:avLst/>
@@ -8272,7 +8272,1544 @@
           <w:lang w:val="en-US"/>
         </w:rPr>
       </w:pPr>
+      <w:r>
+        <w:fldChar w:fldCharType="begin"/>
+      </w:r>
+      <w:r>
+        <w:rPr>
+          <w:lang w:val="en-US"/>
+        </w:rPr>
+        <w:instrText>HYPERLINK "https://github.com/ritaell/alzheimers-transcriptomic-analysis"</w:instrText>
+      </w:r>
+      <w:r>
+        <w:fldChar w:fldCharType="separate"/>
+      </w:r>
+      <w:r>
+        <w:rPr>
+          <w:rStyle w:val="Hyperlink"/>
+          <w:rFonts w:ascii="CMU Serif" w:hAnsi="CMU Serif" w:cs="CMU Serif"/>
+          <w:sz w:val="24"/>
+          <w:szCs w:val="24"/>
+          <w:lang w:val="en-US"/>
+        </w:rPr>
+        <w:t>https://github.com/ritaell/alzheimers-transcriptomic-analysis</w:t>
+      </w:r>
+      <w:r>
+        <w:fldChar w:fldCharType="end"/>
+      </w:r>
+    </w:p>
+    <w:p>
+      <w:pPr>
+        <w:rPr>
+          <w:rFonts w:ascii="CMU Serif" w:hAnsi="CMU Serif" w:cs="CMU Serif"/>
+          <w:sz w:val="24"/>
+          <w:szCs w:val="24"/>
+          <w:lang w:val="en-US"/>
+        </w:rPr>
+      </w:pPr>
+      <w:r>
+        <w:fldChar w:fldCharType="begin"/>
+      </w:r>
+      <w:r>
+        <w:rPr>
+          <w:lang w:val="en-US"/>
+        </w:rPr>
+        <w:instrText>HYPERLINK "https://doi.org/10.5281/zenodo.21198586"</w:instrText>
+      </w:r>
+      <w:r>
+        <w:fldChar w:fldCharType="separate"/>
+      </w:r>
+      <w:r>
+        <w:rPr>
+          <w:rStyle w:val="Hyperlink"/>
+          <w:rFonts w:ascii="CMU Serif" w:hAnsi="CMU Serif" w:cs="CMU Serif"/>
+          <w:sz w:val="24"/>
+          <w:szCs w:val="24"/>
+          <w:lang w:val="en-US"/>
+        </w:rPr>
+        <w:t> DOI: 10.5281/zenodo.21198586</w:t>
+      </w:r>
+      <w:r>
+        <w:fldChar w:fldCharType="end"/>
+      </w:r>
+    </w:p>
+    <w:p>
+      <w:pPr>
+        <w:rPr>
+          <w:rFonts w:ascii="CMU Serif" w:hAnsi="CMU Serif" w:cs="CMU Serif"/>
+          <w:sz w:val="24"/>
+          <w:szCs w:val="24"/>
+          <w:lang w:val="en-US"/>
+        </w:rPr>
+      </w:pPr>
+      <w:r>
+        <w:rPr>
+          <w:rFonts w:ascii="CMU Serif" w:hAnsi="CMU Serif" w:cs="CMU Serif"/>
+          <w:sz w:val="24"/>
+          <w:szCs w:val="24"/>
+          <w:lang w:val="en-US"/>
+        </w:rPr>
+        <w:t xml:space="preserve">[1] Ashburner, M., Ball, C. A., Blake, J. A., Botstein, D., Butler, H., Cherry, J. M., </w:t>
+      </w:r>
+      <w:r>
+        <w:rPr>
+          <w:rFonts w:ascii="CMU Serif" w:hAnsi="CMU Serif" w:cs="CMU Serif"/>
+          <w:i/>
+          <w:iCs/>
+          <w:sz w:val="24"/>
+          <w:szCs w:val="24"/>
+          <w:lang w:val="en-US"/>
+        </w:rPr>
+        <w:t>et al.</w:t>
+      </w:r>
+      <w:r>
+        <w:rPr>
+          <w:rFonts w:ascii="CMU Serif" w:hAnsi="CMU Serif" w:cs="CMU Serif"/>
+          <w:sz w:val="24"/>
+          <w:szCs w:val="24"/>
+          <w:lang w:val="en-US"/>
+        </w:rPr>
+        <w:t xml:space="preserve"> (2000). Gene ontology: Tool for the unification of biology. </w:t>
+      </w:r>
+      <w:r>
+        <w:rPr>
+          <w:rFonts w:ascii="CMU Serif" w:hAnsi="CMU Serif" w:cs="CMU Serif"/>
+          <w:i/>
+          <w:iCs/>
+          <w:sz w:val="24"/>
+          <w:szCs w:val="24"/>
+          <w:lang w:val="en-US"/>
+        </w:rPr>
+        <w:t>Nature Genetics</w:t>
+      </w:r>
+      <w:r>
+        <w:rPr>
+          <w:rFonts w:ascii="CMU Serif" w:hAnsi="CMU Serif" w:cs="CMU Serif"/>
+          <w:sz w:val="24"/>
+          <w:szCs w:val="24"/>
+          <w:lang w:val="en-US"/>
+        </w:rPr>
+        <w:t xml:space="preserve">, 25(1), 25–29. </w:t>
+      </w:r>
+      <w:r>
+        <w:fldChar w:fldCharType="begin"/>
+      </w:r>
+      <w:r>
+        <w:rPr>
+          <w:lang w:val="en-US"/>
+        </w:rPr>
+        <w:instrText>HYPERLINK "https://doi.org/10.1038/75556"</w:instrText>
+      </w:r>
+      <w:r>
+        <w:fldChar w:fldCharType="separate"/>
+      </w:r>
+      <w:r>
+        <w:rPr>
+          <w:rStyle w:val="Hyperlink"/>
+          <w:rFonts w:ascii="CMU Serif" w:hAnsi="CMU Serif" w:cs="CMU Serif"/>
+          <w:sz w:val="24"/>
+          <w:szCs w:val="24"/>
+          <w:lang w:val="en-US"/>
+        </w:rPr>
+        <w:t>https://doi.org/10.1038/75556</w:t>
+      </w:r>
+      <w:r>
+        <w:fldChar w:fldCharType="end"/>
+      </w:r>
+    </w:p>
+    <w:p>
+      <w:pPr>
+        <w:rPr>
+          <w:rFonts w:ascii="CMU Serif" w:hAnsi="CMU Serif" w:cs="CMU Serif"/>
+          <w:sz w:val="24"/>
+          <w:szCs w:val="24"/>
+          <w:lang w:val="en-US"/>
+        </w:rPr>
+      </w:pPr>
+      <w:r>
+        <w:rPr>
+          <w:rFonts w:ascii="CMU Serif" w:hAnsi="CMU Serif" w:cs="CMU Serif"/>
+          <w:sz w:val="24"/>
+          <w:szCs w:val="24"/>
+          <w:lang w:val="en-US"/>
+        </w:rPr>
+        <w:t xml:space="preserve">[2] Benjamini, Y., &amp; Hochberg, Y. (1995). Controlling the false discovery rate: A practical and powerful approach to multiple testing. </w:t>
+      </w:r>
+      <w:r>
+        <w:rPr>
+          <w:rFonts w:ascii="CMU Serif" w:hAnsi="CMU Serif" w:cs="CMU Serif"/>
+          <w:i/>
+          <w:iCs/>
+          <w:sz w:val="24"/>
+          <w:szCs w:val="24"/>
+          <w:lang w:val="en-US"/>
+        </w:rPr>
+        <w:t>Journal of the Royal Statistical Society: Series B</w:t>
+      </w:r>
+      <w:r>
+        <w:rPr>
+          <w:rFonts w:ascii="CMU Serif" w:hAnsi="CMU Serif" w:cs="CMU Serif"/>
+          <w:sz w:val="24"/>
+          <w:szCs w:val="24"/>
+          <w:lang w:val="en-US"/>
+        </w:rPr>
+        <w:t xml:space="preserve">, 57(1), 289–300. </w:t>
+      </w:r>
+      <w:r>
+        <w:fldChar w:fldCharType="begin"/>
+      </w:r>
+      <w:r>
+        <w:rPr>
+          <w:lang w:val="en-US"/>
+        </w:rPr>
+        <w:instrText>HYPERLINK "https://www.jstor.org/stable/2346101"</w:instrText>
+      </w:r>
+      <w:r>
+        <w:fldChar w:fldCharType="separate"/>
+      </w:r>
+      <w:r>
+        <w:rPr>
+          <w:rStyle w:val="Hyperlink"/>
+          <w:rFonts w:ascii="CMU Serif" w:hAnsi="CMU Serif" w:cs="CMU Serif"/>
+          <w:sz w:val="24"/>
+          <w:szCs w:val="24"/>
+          <w:lang w:val="en-US"/>
+        </w:rPr>
+        <w:t>https://www.jstor.org/stable/2346101</w:t>
+      </w:r>
+      <w:r>
+        <w:fldChar w:fldCharType="end"/>
+      </w:r>
+    </w:p>
+    <w:p>
+      <w:pPr>
+        <w:rPr>
+          <w:rFonts w:ascii="CMU Serif" w:hAnsi="CMU Serif" w:cs="CMU Serif"/>
+          <w:sz w:val="24"/>
+          <w:szCs w:val="24"/>
+          <w:lang w:val="en-US"/>
+        </w:rPr>
+      </w:pPr>
+      <w:r>
+        <w:rPr>
+          <w:rFonts w:ascii="CMU Serif" w:hAnsi="CMU Serif" w:cs="CMU Serif"/>
+          <w:sz w:val="24"/>
+          <w:szCs w:val="24"/>
+          <w:lang w:val="en-US"/>
+        </w:rPr>
+        <w:t xml:space="preserve">[3] Chen, E. Y., Tan, C. M., Kou, Y., Duan, Q., Wang, Z., Meirelles, G. V., </w:t>
+      </w:r>
+      <w:r>
+        <w:rPr>
+          <w:rFonts w:ascii="CMU Serif" w:hAnsi="CMU Serif" w:cs="CMU Serif"/>
+          <w:i/>
+          <w:iCs/>
+          <w:sz w:val="24"/>
+          <w:szCs w:val="24"/>
+          <w:lang w:val="en-US"/>
+        </w:rPr>
+        <w:t>et al.</w:t>
+      </w:r>
+      <w:r>
+        <w:rPr>
+          <w:rFonts w:ascii="CMU Serif" w:hAnsi="CMU Serif" w:cs="CMU Serif"/>
+          <w:sz w:val="24"/>
+          <w:szCs w:val="24"/>
+          <w:lang w:val="en-US"/>
+        </w:rPr>
+        <w:t xml:space="preserve"> (2013). </w:t>
+      </w:r>
+      <w:proofErr w:type="spellStart"/>
+      <w:r>
+        <w:rPr>
+          <w:rFonts w:ascii="CMU Serif" w:hAnsi="CMU Serif" w:cs="CMU Serif"/>
+          <w:sz w:val="24"/>
+          <w:szCs w:val="24"/>
+          <w:lang w:val="en-US"/>
+        </w:rPr>
+        <w:t>Enrichr</w:t>
+      </w:r>
+      <w:proofErr w:type="spellEnd"/>
+      <w:r>
+        <w:rPr>
+          <w:rFonts w:ascii="CMU Serif" w:hAnsi="CMU Serif" w:cs="CMU Serif"/>
+          <w:sz w:val="24"/>
+          <w:szCs w:val="24"/>
+          <w:lang w:val="en-US"/>
+        </w:rPr>
+        <w:t xml:space="preserve">: Interactive and collaborative HTML5 gene list enrichment analysis tool. </w:t>
+      </w:r>
+      <w:r>
+        <w:rPr>
+          <w:rFonts w:ascii="CMU Serif" w:hAnsi="CMU Serif" w:cs="CMU Serif"/>
+          <w:i/>
+          <w:iCs/>
+          <w:sz w:val="24"/>
+          <w:szCs w:val="24"/>
+          <w:lang w:val="en-US"/>
+        </w:rPr>
+        <w:t>BMC Bioinformatics</w:t>
+      </w:r>
+      <w:r>
+        <w:rPr>
+          <w:rFonts w:ascii="CMU Serif" w:hAnsi="CMU Serif" w:cs="CMU Serif"/>
+          <w:sz w:val="24"/>
+          <w:szCs w:val="24"/>
+          <w:lang w:val="en-US"/>
+        </w:rPr>
+        <w:t xml:space="preserve">, 14, 128. </w:t>
+      </w:r>
+      <w:r>
+        <w:fldChar w:fldCharType="begin"/>
+      </w:r>
+      <w:r>
+        <w:rPr>
+          <w:lang w:val="en-US"/>
+        </w:rPr>
+        <w:instrText>HYPERLINK "https://doi.org/10.1186/1471-2105-14-128"</w:instrText>
+      </w:r>
+      <w:r>
+        <w:fldChar w:fldCharType="separate"/>
+      </w:r>
+      <w:r>
+        <w:rPr>
+          <w:rStyle w:val="Hyperlink"/>
+          <w:rFonts w:ascii="CMU Serif" w:hAnsi="CMU Serif" w:cs="CMU Serif"/>
+          <w:sz w:val="24"/>
+          <w:szCs w:val="24"/>
+          <w:lang w:val="en-US"/>
+        </w:rPr>
+        <w:t>https://doi.org/10.1186/1471-2105-14-128</w:t>
+      </w:r>
+      <w:r>
+        <w:fldChar w:fldCharType="end"/>
+      </w:r>
+    </w:p>
+    <w:p>
+      <w:pPr>
+        <w:rPr>
+          <w:rFonts w:ascii="CMU Serif" w:hAnsi="CMU Serif" w:cs="CMU Serif"/>
+          <w:sz w:val="24"/>
+          <w:szCs w:val="24"/>
+          <w:lang w:val="en-US"/>
+        </w:rPr>
+      </w:pPr>
+      <w:r>
+        <w:rPr>
+          <w:rFonts w:ascii="CMU Serif" w:hAnsi="CMU Serif" w:cs="CMU Serif"/>
+          <w:sz w:val="24"/>
+          <w:szCs w:val="24"/>
+          <w:lang w:val="en-US"/>
+        </w:rPr>
+        <w:lastRenderedPageBreak/>
+        <w:t xml:space="preserve">[4] Edgar, R., Domrachev, M., &amp; Lash, A. E. (2002). Gene Expression Omnibus: NCBI gene expression and hybridization array data repository. </w:t>
+      </w:r>
+      <w:r>
+        <w:rPr>
+          <w:rFonts w:ascii="CMU Serif" w:hAnsi="CMU Serif" w:cs="CMU Serif"/>
+          <w:i/>
+          <w:iCs/>
+          <w:sz w:val="24"/>
+          <w:szCs w:val="24"/>
+          <w:lang w:val="en-US"/>
+        </w:rPr>
+        <w:t>Nucleic Acids Research</w:t>
+      </w:r>
+      <w:r>
+        <w:rPr>
+          <w:rFonts w:ascii="CMU Serif" w:hAnsi="CMU Serif" w:cs="CMU Serif"/>
+          <w:sz w:val="24"/>
+          <w:szCs w:val="24"/>
+          <w:lang w:val="en-US"/>
+        </w:rPr>
+        <w:t xml:space="preserve">, 30(1), 207–210. </w:t>
+      </w:r>
+      <w:r>
+        <w:fldChar w:fldCharType="begin"/>
+      </w:r>
+      <w:r>
+        <w:rPr>
+          <w:lang w:val="en-US"/>
+        </w:rPr>
+        <w:instrText>HYPERLINK "https://doi.org/10.1093/nar/30.1.207"</w:instrText>
+      </w:r>
+      <w:r>
+        <w:fldChar w:fldCharType="separate"/>
+      </w:r>
+      <w:r>
+        <w:rPr>
+          <w:rStyle w:val="Hyperlink"/>
+          <w:rFonts w:ascii="CMU Serif" w:hAnsi="CMU Serif" w:cs="CMU Serif"/>
+          <w:sz w:val="24"/>
+          <w:szCs w:val="24"/>
+          <w:lang w:val="en-US"/>
+        </w:rPr>
+        <w:t>https://doi.org/10.1093/nar/30.1.207</w:t>
+      </w:r>
+      <w:r>
+        <w:fldChar w:fldCharType="end"/>
+      </w:r>
+    </w:p>
+    <w:p>
+      <w:pPr>
+        <w:rPr>
+          <w:rFonts w:ascii="CMU Serif" w:hAnsi="CMU Serif" w:cs="CMU Serif"/>
+          <w:sz w:val="24"/>
+          <w:szCs w:val="24"/>
+          <w:lang w:val="en-US"/>
+        </w:rPr>
+      </w:pPr>
+      <w:r>
+        <w:rPr>
+          <w:rFonts w:ascii="CMU Serif" w:hAnsi="CMU Serif" w:cs="CMU Serif"/>
+          <w:sz w:val="24"/>
+          <w:szCs w:val="24"/>
+          <w:lang w:val="en-US"/>
+        </w:rPr>
+        <w:t xml:space="preserve">[5] Fang, Z., Liu, X., &amp; Peltz, G. (2023). </w:t>
+      </w:r>
+      <w:proofErr w:type="spellStart"/>
+      <w:r>
+        <w:rPr>
+          <w:rFonts w:ascii="CMU Serif" w:hAnsi="CMU Serif" w:cs="CMU Serif"/>
+          <w:sz w:val="24"/>
+          <w:szCs w:val="24"/>
+          <w:lang w:val="en-US"/>
+        </w:rPr>
+        <w:t>GSEApy</w:t>
+      </w:r>
+      <w:proofErr w:type="spellEnd"/>
+      <w:r>
+        <w:rPr>
+          <w:rFonts w:ascii="CMU Serif" w:hAnsi="CMU Serif" w:cs="CMU Serif"/>
+          <w:sz w:val="24"/>
+          <w:szCs w:val="24"/>
+          <w:lang w:val="en-US"/>
+        </w:rPr>
+        <w:t xml:space="preserve">: A comprehensive package for performing gene set enrichment analysis in Python. </w:t>
+      </w:r>
+      <w:r>
+        <w:rPr>
+          <w:rFonts w:ascii="CMU Serif" w:hAnsi="CMU Serif" w:cs="CMU Serif"/>
+          <w:i/>
+          <w:iCs/>
+          <w:sz w:val="24"/>
+          <w:szCs w:val="24"/>
+          <w:lang w:val="en-US"/>
+        </w:rPr>
+        <w:t>Bioinformatics</w:t>
+      </w:r>
+      <w:r>
+        <w:rPr>
+          <w:rFonts w:ascii="CMU Serif" w:hAnsi="CMU Serif" w:cs="CMU Serif"/>
+          <w:sz w:val="24"/>
+          <w:szCs w:val="24"/>
+          <w:lang w:val="en-US"/>
+        </w:rPr>
+        <w:t xml:space="preserve">, 39(1). </w:t>
+      </w:r>
+      <w:r>
+        <w:fldChar w:fldCharType="begin"/>
+      </w:r>
+      <w:r>
+        <w:rPr>
+          <w:lang w:val="en-US"/>
+        </w:rPr>
+        <w:instrText>HYPERLINK "https://doi.org/10.1093/bioinformatics/btac757"</w:instrText>
+      </w:r>
+      <w:r>
+        <w:fldChar w:fldCharType="separate"/>
+      </w:r>
+      <w:r>
+        <w:rPr>
+          <w:rStyle w:val="Hyperlink"/>
+          <w:rFonts w:ascii="CMU Serif" w:hAnsi="CMU Serif" w:cs="CMU Serif"/>
+          <w:sz w:val="24"/>
+          <w:szCs w:val="24"/>
+          <w:lang w:val="en-US"/>
+        </w:rPr>
+        <w:t>https://doi.org/10.1093/bioinformatics/btac757</w:t>
+      </w:r>
+      <w:r>
+        <w:fldChar w:fldCharType="end"/>
+      </w:r>
+    </w:p>
+    <w:p>
+      <w:pPr>
+        <w:rPr>
+          <w:rFonts w:ascii="CMU Serif" w:hAnsi="CMU Serif" w:cs="CMU Serif"/>
+          <w:sz w:val="24"/>
+          <w:szCs w:val="24"/>
+          <w:lang w:val="en-US"/>
+        </w:rPr>
+      </w:pPr>
+      <w:r>
+        <w:rPr>
+          <w:rFonts w:ascii="CMU Serif" w:hAnsi="CMU Serif" w:cs="CMU Serif"/>
+          <w:sz w:val="24"/>
+          <w:szCs w:val="24"/>
+          <w:lang w:val="en-US"/>
+        </w:rPr>
+        <w:t xml:space="preserve">[6] </w:t>
+      </w:r>
+      <w:proofErr w:type="spellStart"/>
+      <w:r>
+        <w:rPr>
+          <w:rFonts w:ascii="CMU Serif" w:hAnsi="CMU Serif" w:cs="CMU Serif"/>
+          <w:sz w:val="24"/>
+          <w:szCs w:val="24"/>
+          <w:lang w:val="en-US"/>
+        </w:rPr>
+        <w:t>Kanehisa</w:t>
+      </w:r>
+      <w:proofErr w:type="spellEnd"/>
+      <w:r>
+        <w:rPr>
+          <w:rFonts w:ascii="CMU Serif" w:hAnsi="CMU Serif" w:cs="CMU Serif"/>
+          <w:sz w:val="24"/>
+          <w:szCs w:val="24"/>
+          <w:lang w:val="en-US"/>
+        </w:rPr>
+        <w:t xml:space="preserve">, M., </w:t>
+      </w:r>
+      <w:proofErr w:type="spellStart"/>
+      <w:r>
+        <w:rPr>
+          <w:rFonts w:ascii="CMU Serif" w:hAnsi="CMU Serif" w:cs="CMU Serif"/>
+          <w:sz w:val="24"/>
+          <w:szCs w:val="24"/>
+          <w:lang w:val="en-US"/>
+        </w:rPr>
+        <w:t>Furumichi</w:t>
+      </w:r>
+      <w:proofErr w:type="spellEnd"/>
+      <w:r>
+        <w:rPr>
+          <w:rFonts w:ascii="CMU Serif" w:hAnsi="CMU Serif" w:cs="CMU Serif"/>
+          <w:sz w:val="24"/>
+          <w:szCs w:val="24"/>
+          <w:lang w:val="en-US"/>
+        </w:rPr>
+        <w:t xml:space="preserve">, M., Sato, Y., Kawashima, M., &amp; Ishiguro-Watanabe, M. (2023). KEGG for taxonomy-based analysis of pathways and genomes. </w:t>
+      </w:r>
+      <w:r>
+        <w:rPr>
+          <w:rFonts w:ascii="CMU Serif" w:hAnsi="CMU Serif" w:cs="CMU Serif"/>
+          <w:i/>
+          <w:iCs/>
+          <w:sz w:val="24"/>
+          <w:szCs w:val="24"/>
+          <w:lang w:val="en-US"/>
+        </w:rPr>
+        <w:t>Nucleic Acids Research</w:t>
+      </w:r>
+      <w:r>
+        <w:rPr>
+          <w:rFonts w:ascii="CMU Serif" w:hAnsi="CMU Serif" w:cs="CMU Serif"/>
+          <w:sz w:val="24"/>
+          <w:szCs w:val="24"/>
+          <w:lang w:val="en-US"/>
+        </w:rPr>
+        <w:t xml:space="preserve">, 51(D1), D587–D592. </w:t>
+      </w:r>
+      <w:r>
+        <w:fldChar w:fldCharType="begin"/>
+      </w:r>
+      <w:r>
+        <w:rPr>
+          <w:lang w:val="en-US"/>
+        </w:rPr>
+        <w:instrText>HYPERLINK "https://doi.org/10.1093/nar/gkac963"</w:instrText>
+      </w:r>
+      <w:r>
+        <w:fldChar w:fldCharType="separate"/>
+      </w:r>
+      <w:r>
+        <w:rPr>
+          <w:rStyle w:val="Hyperlink"/>
+          <w:rFonts w:ascii="CMU Serif" w:hAnsi="CMU Serif" w:cs="CMU Serif"/>
+          <w:sz w:val="24"/>
+          <w:szCs w:val="24"/>
+          <w:lang w:val="en-US"/>
+        </w:rPr>
+        <w:t>https://doi.org/10.1093/nar/gkac963</w:t>
+      </w:r>
+      <w:r>
+        <w:fldChar w:fldCharType="end"/>
+      </w:r>
+    </w:p>
+    <w:p>
+      <w:pPr>
+        <w:rPr>
+          <w:rFonts w:ascii="CMU Serif" w:hAnsi="CMU Serif" w:cs="CMU Serif"/>
+          <w:sz w:val="24"/>
+          <w:szCs w:val="24"/>
+          <w:lang w:val="en-US"/>
+        </w:rPr>
+      </w:pPr>
+      <w:r>
+        <w:rPr>
+          <w:rFonts w:ascii="CMU Serif" w:hAnsi="CMU Serif" w:cs="CMU Serif"/>
+          <w:sz w:val="24"/>
+          <w:szCs w:val="24"/>
+          <w:lang w:val="en-US"/>
+        </w:rPr>
+        <w:t xml:space="preserve">[7] </w:t>
+      </w:r>
+      <w:proofErr w:type="spellStart"/>
+      <w:r>
+        <w:rPr>
+          <w:rFonts w:ascii="CMU Serif" w:hAnsi="CMU Serif" w:cs="CMU Serif"/>
+          <w:sz w:val="24"/>
+          <w:szCs w:val="24"/>
+          <w:lang w:val="en-US"/>
+        </w:rPr>
+        <w:t>McKhann</w:t>
+      </w:r>
+      <w:proofErr w:type="spellEnd"/>
+      <w:r>
+        <w:rPr>
+          <w:rFonts w:ascii="CMU Serif" w:hAnsi="CMU Serif" w:cs="CMU Serif"/>
+          <w:sz w:val="24"/>
+          <w:szCs w:val="24"/>
+          <w:lang w:val="en-US"/>
+        </w:rPr>
+        <w:t xml:space="preserve">, G. M., </w:t>
+      </w:r>
+      <w:proofErr w:type="spellStart"/>
+      <w:r>
+        <w:rPr>
+          <w:rFonts w:ascii="CMU Serif" w:hAnsi="CMU Serif" w:cs="CMU Serif"/>
+          <w:sz w:val="24"/>
+          <w:szCs w:val="24"/>
+          <w:lang w:val="en-US"/>
+        </w:rPr>
+        <w:t>Knopman</w:t>
+      </w:r>
+      <w:proofErr w:type="spellEnd"/>
+      <w:r>
+        <w:rPr>
+          <w:rFonts w:ascii="CMU Serif" w:hAnsi="CMU Serif" w:cs="CMU Serif"/>
+          <w:sz w:val="24"/>
+          <w:szCs w:val="24"/>
+          <w:lang w:val="en-US"/>
+        </w:rPr>
+        <w:t xml:space="preserve">, D. S., </w:t>
+      </w:r>
+      <w:proofErr w:type="spellStart"/>
+      <w:r>
+        <w:rPr>
+          <w:rFonts w:ascii="CMU Serif" w:hAnsi="CMU Serif" w:cs="CMU Serif"/>
+          <w:sz w:val="24"/>
+          <w:szCs w:val="24"/>
+          <w:lang w:val="en-US"/>
+        </w:rPr>
+        <w:t>Chertkow</w:t>
+      </w:r>
+      <w:proofErr w:type="spellEnd"/>
+      <w:r>
+        <w:rPr>
+          <w:rFonts w:ascii="CMU Serif" w:hAnsi="CMU Serif" w:cs="CMU Serif"/>
+          <w:sz w:val="24"/>
+          <w:szCs w:val="24"/>
+          <w:lang w:val="en-US"/>
+        </w:rPr>
+        <w:t xml:space="preserve">, H., Hyman, B. T., Jack, C. R., Kawas, C. H., </w:t>
+      </w:r>
+      <w:r>
+        <w:rPr>
+          <w:rFonts w:ascii="CMU Serif" w:hAnsi="CMU Serif" w:cs="CMU Serif"/>
+          <w:i/>
+          <w:iCs/>
+          <w:sz w:val="24"/>
+          <w:szCs w:val="24"/>
+          <w:lang w:val="en-US"/>
+        </w:rPr>
+        <w:t>et al.</w:t>
+      </w:r>
+      <w:r>
+        <w:rPr>
+          <w:rFonts w:ascii="CMU Serif" w:hAnsi="CMU Serif" w:cs="CMU Serif"/>
+          <w:sz w:val="24"/>
+          <w:szCs w:val="24"/>
+          <w:lang w:val="en-US"/>
+        </w:rPr>
+        <w:t xml:space="preserve"> (2011). The diagnosis of dementia due to Alzheimer's disease: Recommendations from the National Institute on Aging–Alzheimer's Association workgroups. </w:t>
+      </w:r>
+      <w:r>
+        <w:rPr>
+          <w:rFonts w:ascii="CMU Serif" w:hAnsi="CMU Serif" w:cs="CMU Serif"/>
+          <w:i/>
+          <w:iCs/>
+          <w:sz w:val="24"/>
+          <w:szCs w:val="24"/>
+          <w:lang w:val="en-US"/>
+        </w:rPr>
+        <w:t>Alzheimer's &amp; Dementia</w:t>
+      </w:r>
+      <w:r>
+        <w:rPr>
+          <w:rFonts w:ascii="CMU Serif" w:hAnsi="CMU Serif" w:cs="CMU Serif"/>
+          <w:sz w:val="24"/>
+          <w:szCs w:val="24"/>
+          <w:lang w:val="en-US"/>
+        </w:rPr>
+        <w:t xml:space="preserve">, 7(3), 263–269. </w:t>
+      </w:r>
+      <w:r>
+        <w:fldChar w:fldCharType="begin"/>
+      </w:r>
+      <w:r>
+        <w:rPr>
+          <w:lang w:val="en-US"/>
+        </w:rPr>
+        <w:instrText>HYPERLINK "https://doi.org/10.1016/j.jalz.2011.03.005"</w:instrText>
+      </w:r>
+      <w:r>
+        <w:fldChar w:fldCharType="separate"/>
+      </w:r>
+      <w:r>
+        <w:rPr>
+          <w:rStyle w:val="Hyperlink"/>
+          <w:rFonts w:ascii="CMU Serif" w:hAnsi="CMU Serif" w:cs="CMU Serif"/>
+          <w:sz w:val="24"/>
+          <w:szCs w:val="24"/>
+          <w:lang w:val="en-US"/>
+        </w:rPr>
+        <w:t>https://doi.org/10.1016/j.jalz.2011.03.005</w:t>
+      </w:r>
+      <w:r>
+        <w:fldChar w:fldCharType="end"/>
+      </w:r>
+    </w:p>
+    <w:p>
+      <w:pPr>
+        <w:rPr>
+          <w:rFonts w:ascii="CMU Serif" w:hAnsi="CMU Serif" w:cs="CMU Serif"/>
+          <w:sz w:val="24"/>
+          <w:szCs w:val="24"/>
+          <w:lang w:val="en-US"/>
+        </w:rPr>
+      </w:pPr>
+      <w:r>
+        <w:rPr>
+          <w:rFonts w:ascii="CMU Serif" w:hAnsi="CMU Serif" w:cs="CMU Serif"/>
+          <w:sz w:val="24"/>
+          <w:szCs w:val="24"/>
+          <w:lang w:val="en-US"/>
+        </w:rPr>
+        <w:t xml:space="preserve">[8] McKinney, W. (2010). Data structures for statistical computing in Python. </w:t>
+      </w:r>
+      <w:r>
+        <w:rPr>
+          <w:rFonts w:ascii="CMU Serif" w:hAnsi="CMU Serif" w:cs="CMU Serif"/>
+          <w:i/>
+          <w:iCs/>
+          <w:sz w:val="24"/>
+          <w:szCs w:val="24"/>
+          <w:lang w:val="en-US"/>
+        </w:rPr>
+        <w:t>Proceedings of the 9th Python in Science Conference</w:t>
+      </w:r>
+      <w:r>
+        <w:rPr>
+          <w:rFonts w:ascii="CMU Serif" w:hAnsi="CMU Serif" w:cs="CMU Serif"/>
+          <w:sz w:val="24"/>
+          <w:szCs w:val="24"/>
+          <w:lang w:val="en-US"/>
+        </w:rPr>
+        <w:t>, 51–56.</w:t>
+      </w:r>
+    </w:p>
+    <w:p>
+      <w:pPr>
+        <w:rPr>
+          <w:rFonts w:ascii="CMU Serif" w:hAnsi="CMU Serif" w:cs="CMU Serif"/>
+          <w:sz w:val="24"/>
+          <w:szCs w:val="24"/>
+          <w:lang w:val="en-US"/>
+        </w:rPr>
+      </w:pPr>
+      <w:r>
+        <w:rPr>
+          <w:rFonts w:ascii="CMU Serif" w:hAnsi="CMU Serif" w:cs="CMU Serif"/>
+          <w:sz w:val="24"/>
+          <w:szCs w:val="24"/>
+          <w:lang w:val="en-US"/>
+        </w:rPr>
+        <w:t xml:space="preserve">[9] Narayanan, M., Huynh, J. L., Wang, K., Yang, X., Yoo, S., McElwee, J., </w:t>
+      </w:r>
+      <w:r>
+        <w:rPr>
+          <w:rFonts w:ascii="CMU Serif" w:hAnsi="CMU Serif" w:cs="CMU Serif"/>
+          <w:i/>
+          <w:iCs/>
+          <w:sz w:val="24"/>
+          <w:szCs w:val="24"/>
+          <w:lang w:val="en-US"/>
+        </w:rPr>
+        <w:t>et al.</w:t>
+      </w:r>
+      <w:r>
+        <w:rPr>
+          <w:rFonts w:ascii="CMU Serif" w:hAnsi="CMU Serif" w:cs="CMU Serif"/>
+          <w:sz w:val="24"/>
+          <w:szCs w:val="24"/>
+          <w:lang w:val="en-US"/>
+        </w:rPr>
+        <w:t xml:space="preserve"> (2014). Common dysregulation network in the human prefrontal cortex underlies two neurodegenerative diseases. </w:t>
+      </w:r>
+      <w:r>
+        <w:rPr>
+          <w:rFonts w:ascii="CMU Serif" w:hAnsi="CMU Serif" w:cs="CMU Serif"/>
+          <w:i/>
+          <w:iCs/>
+          <w:sz w:val="24"/>
+          <w:szCs w:val="24"/>
+          <w:lang w:val="en-US"/>
+        </w:rPr>
+        <w:t>Molecular Systems Biology</w:t>
+      </w:r>
+      <w:r>
+        <w:rPr>
+          <w:rFonts w:ascii="CMU Serif" w:hAnsi="CMU Serif" w:cs="CMU Serif"/>
+          <w:sz w:val="24"/>
+          <w:szCs w:val="24"/>
+          <w:lang w:val="en-US"/>
+        </w:rPr>
+        <w:t xml:space="preserve">, 10, 743. </w:t>
+      </w:r>
+      <w:r>
+        <w:fldChar w:fldCharType="begin"/>
+      </w:r>
+      <w:r>
+        <w:rPr>
+          <w:lang w:val="en-US"/>
+        </w:rPr>
+        <w:instrText>HYPERLINK "https://doi.org/10.15252/msb.20145304"</w:instrText>
+      </w:r>
+      <w:r>
+        <w:fldChar w:fldCharType="separate"/>
+      </w:r>
+      <w:r>
+        <w:rPr>
+          <w:rStyle w:val="Hyperlink"/>
+          <w:rFonts w:ascii="CMU Serif" w:hAnsi="CMU Serif" w:cs="CMU Serif"/>
+          <w:sz w:val="24"/>
+          <w:szCs w:val="24"/>
+          <w:lang w:val="en-US"/>
+        </w:rPr>
+        <w:t>https://doi.org/10.15252/msb.20145304</w:t>
+      </w:r>
+      <w:r>
+        <w:fldChar w:fldCharType="end"/>
+      </w:r>
+    </w:p>
+    <w:p>
+      <w:pPr>
+        <w:rPr>
+          <w:rFonts w:ascii="CMU Serif" w:hAnsi="CMU Serif" w:cs="CMU Serif"/>
+          <w:sz w:val="24"/>
+          <w:szCs w:val="24"/>
+          <w:lang w:val="en-US"/>
+        </w:rPr>
+      </w:pPr>
+      <w:r>
+        <w:rPr>
+          <w:rFonts w:ascii="CMU Serif" w:hAnsi="CMU Serif" w:cs="CMU Serif"/>
+          <w:sz w:val="24"/>
+          <w:szCs w:val="24"/>
+          <w:lang w:val="en-US"/>
+        </w:rPr>
+        <w:t xml:space="preserve">[10] Pedregosa, F., </w:t>
+      </w:r>
+      <w:proofErr w:type="spellStart"/>
+      <w:r>
+        <w:rPr>
+          <w:rFonts w:ascii="CMU Serif" w:hAnsi="CMU Serif" w:cs="CMU Serif"/>
+          <w:sz w:val="24"/>
+          <w:szCs w:val="24"/>
+          <w:lang w:val="en-US"/>
+        </w:rPr>
+        <w:t>Varoquaux</w:t>
+      </w:r>
+      <w:proofErr w:type="spellEnd"/>
+      <w:r>
+        <w:rPr>
+          <w:rFonts w:ascii="CMU Serif" w:hAnsi="CMU Serif" w:cs="CMU Serif"/>
+          <w:sz w:val="24"/>
+          <w:szCs w:val="24"/>
+          <w:lang w:val="en-US"/>
+        </w:rPr>
+        <w:t xml:space="preserve">, G., </w:t>
+      </w:r>
+      <w:proofErr w:type="spellStart"/>
+      <w:r>
+        <w:rPr>
+          <w:rFonts w:ascii="CMU Serif" w:hAnsi="CMU Serif" w:cs="CMU Serif"/>
+          <w:sz w:val="24"/>
+          <w:szCs w:val="24"/>
+          <w:lang w:val="en-US"/>
+        </w:rPr>
+        <w:t>Gramfort</w:t>
+      </w:r>
+      <w:proofErr w:type="spellEnd"/>
+      <w:r>
+        <w:rPr>
+          <w:rFonts w:ascii="CMU Serif" w:hAnsi="CMU Serif" w:cs="CMU Serif"/>
+          <w:sz w:val="24"/>
+          <w:szCs w:val="24"/>
+          <w:lang w:val="en-US"/>
+        </w:rPr>
+        <w:t xml:space="preserve">, A., Michel, V., Thirion, B., Grisel, O., </w:t>
+      </w:r>
+      <w:r>
+        <w:rPr>
+          <w:rFonts w:ascii="CMU Serif" w:hAnsi="CMU Serif" w:cs="CMU Serif"/>
+          <w:i/>
+          <w:iCs/>
+          <w:sz w:val="24"/>
+          <w:szCs w:val="24"/>
+          <w:lang w:val="en-US"/>
+        </w:rPr>
+        <w:t>et al.</w:t>
+      </w:r>
+      <w:r>
+        <w:rPr>
+          <w:rFonts w:ascii="CMU Serif" w:hAnsi="CMU Serif" w:cs="CMU Serif"/>
+          <w:sz w:val="24"/>
+          <w:szCs w:val="24"/>
+          <w:lang w:val="en-US"/>
+        </w:rPr>
+        <w:t xml:space="preserve"> (2011). Scikit-learn: Machine learning in Python. </w:t>
+      </w:r>
+      <w:r>
+        <w:rPr>
+          <w:rFonts w:ascii="CMU Serif" w:hAnsi="CMU Serif" w:cs="CMU Serif"/>
+          <w:i/>
+          <w:iCs/>
+          <w:sz w:val="24"/>
+          <w:szCs w:val="24"/>
+          <w:lang w:val="en-US"/>
+        </w:rPr>
+        <w:t>Journal of Machine Learning Research</w:t>
+      </w:r>
+      <w:r>
+        <w:rPr>
+          <w:rFonts w:ascii="CMU Serif" w:hAnsi="CMU Serif" w:cs="CMU Serif"/>
+          <w:sz w:val="24"/>
+          <w:szCs w:val="24"/>
+          <w:lang w:val="en-US"/>
+        </w:rPr>
+        <w:t>, 12, 2825–2830.</w:t>
+      </w:r>
+    </w:p>
+    <w:p>
+      <w:pPr>
+        <w:rPr>
+          <w:rFonts w:ascii="CMU Serif" w:hAnsi="CMU Serif" w:cs="CMU Serif"/>
+          <w:sz w:val="24"/>
+          <w:szCs w:val="24"/>
+          <w:lang w:val="en-US"/>
+        </w:rPr>
+      </w:pPr>
+      <w:r>
+        <w:rPr>
+          <w:rFonts w:ascii="CMU Serif" w:hAnsi="CMU Serif" w:cs="CMU Serif"/>
+          <w:sz w:val="24"/>
+          <w:szCs w:val="24"/>
+          <w:lang w:val="en-US"/>
+        </w:rPr>
+        <w:t xml:space="preserve">[11] Ritchie, M. E., </w:t>
+      </w:r>
+      <w:proofErr w:type="spellStart"/>
+      <w:r>
+        <w:rPr>
+          <w:rFonts w:ascii="CMU Serif" w:hAnsi="CMU Serif" w:cs="CMU Serif"/>
+          <w:sz w:val="24"/>
+          <w:szCs w:val="24"/>
+          <w:lang w:val="en-US"/>
+        </w:rPr>
+        <w:t>Phipson</w:t>
+      </w:r>
+      <w:proofErr w:type="spellEnd"/>
+      <w:r>
+        <w:rPr>
+          <w:rFonts w:ascii="CMU Serif" w:hAnsi="CMU Serif" w:cs="CMU Serif"/>
+          <w:sz w:val="24"/>
+          <w:szCs w:val="24"/>
+          <w:lang w:val="en-US"/>
+        </w:rPr>
+        <w:t xml:space="preserve">, B., Wu, D., Hu, Y., Law, C. W., Shi, W., &amp; Smyth, G. K. (2015). </w:t>
+      </w:r>
+      <w:proofErr w:type="spellStart"/>
+      <w:r>
+        <w:rPr>
+          <w:rFonts w:ascii="CMU Serif" w:hAnsi="CMU Serif" w:cs="CMU Serif"/>
+          <w:sz w:val="24"/>
+          <w:szCs w:val="24"/>
+          <w:lang w:val="en-US"/>
+        </w:rPr>
+        <w:t>limma</w:t>
+      </w:r>
+      <w:proofErr w:type="spellEnd"/>
+      <w:r>
+        <w:rPr>
+          <w:rFonts w:ascii="CMU Serif" w:hAnsi="CMU Serif" w:cs="CMU Serif"/>
+          <w:sz w:val="24"/>
+          <w:szCs w:val="24"/>
+          <w:lang w:val="en-US"/>
+        </w:rPr>
+        <w:t xml:space="preserve"> powers differential expression analyses for RNA-sequencing and microarray studies. </w:t>
+      </w:r>
+      <w:r>
+        <w:rPr>
+          <w:rFonts w:ascii="CMU Serif" w:hAnsi="CMU Serif" w:cs="CMU Serif"/>
+          <w:i/>
+          <w:iCs/>
+          <w:sz w:val="24"/>
+          <w:szCs w:val="24"/>
+          <w:lang w:val="en-US"/>
+        </w:rPr>
+        <w:t>Nucleic Acids Research</w:t>
+      </w:r>
+      <w:r>
+        <w:rPr>
+          <w:rFonts w:ascii="CMU Serif" w:hAnsi="CMU Serif" w:cs="CMU Serif"/>
+          <w:sz w:val="24"/>
+          <w:szCs w:val="24"/>
+          <w:lang w:val="en-US"/>
+        </w:rPr>
+        <w:t xml:space="preserve">, 43(7), e47. </w:t>
+      </w:r>
+      <w:r>
+        <w:fldChar w:fldCharType="begin"/>
+      </w:r>
+      <w:r>
+        <w:rPr>
+          <w:lang w:val="en-US"/>
+        </w:rPr>
+        <w:instrText>HYPERLINK "https://doi.org/10.1093/nar/gkv007"</w:instrText>
+      </w:r>
+      <w:r>
+        <w:fldChar w:fldCharType="separate"/>
+      </w:r>
+      <w:r>
+        <w:rPr>
+          <w:rStyle w:val="Hyperlink"/>
+          <w:rFonts w:ascii="CMU Serif" w:hAnsi="CMU Serif" w:cs="CMU Serif"/>
+          <w:sz w:val="24"/>
+          <w:szCs w:val="24"/>
+          <w:lang w:val="en-US"/>
+        </w:rPr>
+        <w:t>https://doi.org/10.1093/nar/gkv007</w:t>
+      </w:r>
+      <w:r>
+        <w:fldChar w:fldCharType="end"/>
+      </w:r>
+    </w:p>
+    <w:p>
+      <w:pPr>
+        <w:rPr>
+          <w:rFonts w:ascii="CMU Serif" w:hAnsi="CMU Serif" w:cs="CMU Serif"/>
+          <w:sz w:val="24"/>
+          <w:szCs w:val="24"/>
+          <w:lang w:val="en-US"/>
+        </w:rPr>
+      </w:pPr>
+      <w:r>
+        <w:rPr>
+          <w:rFonts w:ascii="CMU Serif" w:hAnsi="CMU Serif" w:cs="CMU Serif"/>
+          <w:sz w:val="24"/>
+          <w:szCs w:val="24"/>
+          <w:lang w:val="en-US"/>
+        </w:rPr>
+        <w:t xml:space="preserve">[12] Smyth, G. K. (2004). Linear models and empirical Bayes methods for assessing differential expression in microarray experiments. </w:t>
+      </w:r>
+      <w:r>
+        <w:rPr>
+          <w:rFonts w:ascii="CMU Serif" w:hAnsi="CMU Serif" w:cs="CMU Serif"/>
+          <w:i/>
+          <w:iCs/>
+          <w:sz w:val="24"/>
+          <w:szCs w:val="24"/>
+          <w:lang w:val="en-US"/>
+        </w:rPr>
+        <w:t>Statistical Applications in Genetics and Molecular Biology</w:t>
+      </w:r>
+      <w:r>
+        <w:rPr>
+          <w:rFonts w:ascii="CMU Serif" w:hAnsi="CMU Serif" w:cs="CMU Serif"/>
+          <w:sz w:val="24"/>
+          <w:szCs w:val="24"/>
+          <w:lang w:val="en-US"/>
+        </w:rPr>
+        <w:t xml:space="preserve">, 3(1). </w:t>
+      </w:r>
+      <w:r>
+        <w:fldChar w:fldCharType="begin"/>
+      </w:r>
+      <w:r>
+        <w:rPr>
+          <w:lang w:val="en-US"/>
+        </w:rPr>
+        <w:instrText>HYPERLINK "https://doi.org/10.2202/1544-6115.1027"</w:instrText>
+      </w:r>
+      <w:r>
+        <w:fldChar w:fldCharType="separate"/>
+      </w:r>
+      <w:r>
+        <w:rPr>
+          <w:rStyle w:val="Hyperlink"/>
+          <w:rFonts w:ascii="CMU Serif" w:hAnsi="CMU Serif" w:cs="CMU Serif"/>
+          <w:sz w:val="24"/>
+          <w:szCs w:val="24"/>
+          <w:lang w:val="en-US"/>
+        </w:rPr>
+        <w:t>https://doi.org/10.2202/1544-6115.1027</w:t>
+      </w:r>
+      <w:r>
+        <w:fldChar w:fldCharType="end"/>
+      </w:r>
+    </w:p>
+    <w:p>
+      <w:pPr>
+        <w:rPr>
+          <w:rFonts w:ascii="CMU Serif" w:hAnsi="CMU Serif" w:cs="CMU Serif"/>
+          <w:sz w:val="24"/>
+          <w:szCs w:val="24"/>
+          <w:lang w:val="en-US"/>
+        </w:rPr>
+      </w:pPr>
+      <w:r>
+        <w:rPr>
+          <w:rFonts w:ascii="CMU Serif" w:hAnsi="CMU Serif" w:cs="CMU Serif"/>
+          <w:sz w:val="24"/>
+          <w:szCs w:val="24"/>
+          <w:lang w:val="en-US"/>
+        </w:rPr>
+        <w:t xml:space="preserve">[13] </w:t>
+      </w:r>
+      <w:proofErr w:type="spellStart"/>
+      <w:r>
+        <w:rPr>
+          <w:rFonts w:ascii="CMU Serif" w:hAnsi="CMU Serif" w:cs="CMU Serif"/>
+          <w:sz w:val="24"/>
+          <w:szCs w:val="24"/>
+          <w:lang w:val="en-US"/>
+        </w:rPr>
+        <w:t>Szklarczyk</w:t>
+      </w:r>
+      <w:proofErr w:type="spellEnd"/>
+      <w:r>
+        <w:rPr>
+          <w:rFonts w:ascii="CMU Serif" w:hAnsi="CMU Serif" w:cs="CMU Serif"/>
+          <w:sz w:val="24"/>
+          <w:szCs w:val="24"/>
+          <w:lang w:val="en-US"/>
+        </w:rPr>
+        <w:t xml:space="preserve">, D., Gable, A. L., </w:t>
+      </w:r>
+      <w:proofErr w:type="spellStart"/>
+      <w:r>
+        <w:rPr>
+          <w:rFonts w:ascii="CMU Serif" w:hAnsi="CMU Serif" w:cs="CMU Serif"/>
+          <w:sz w:val="24"/>
+          <w:szCs w:val="24"/>
+          <w:lang w:val="en-US"/>
+        </w:rPr>
+        <w:t>Nastou</w:t>
+      </w:r>
+      <w:proofErr w:type="spellEnd"/>
+      <w:r>
+        <w:rPr>
+          <w:rFonts w:ascii="CMU Serif" w:hAnsi="CMU Serif" w:cs="CMU Serif"/>
+          <w:sz w:val="24"/>
+          <w:szCs w:val="24"/>
+          <w:lang w:val="en-US"/>
+        </w:rPr>
+        <w:t xml:space="preserve">, K. C., Lyon, D., Kirsch, R., </w:t>
+      </w:r>
+      <w:proofErr w:type="spellStart"/>
+      <w:r>
+        <w:rPr>
+          <w:rFonts w:ascii="CMU Serif" w:hAnsi="CMU Serif" w:cs="CMU Serif"/>
+          <w:sz w:val="24"/>
+          <w:szCs w:val="24"/>
+          <w:lang w:val="en-US"/>
+        </w:rPr>
+        <w:t>Pyysalo</w:t>
+      </w:r>
+      <w:proofErr w:type="spellEnd"/>
+      <w:r>
+        <w:rPr>
+          <w:rFonts w:ascii="CMU Serif" w:hAnsi="CMU Serif" w:cs="CMU Serif"/>
+          <w:sz w:val="24"/>
+          <w:szCs w:val="24"/>
+          <w:lang w:val="en-US"/>
+        </w:rPr>
+        <w:t xml:space="preserve">, S., </w:t>
+      </w:r>
+      <w:r>
+        <w:rPr>
+          <w:rFonts w:ascii="CMU Serif" w:hAnsi="CMU Serif" w:cs="CMU Serif"/>
+          <w:i/>
+          <w:iCs/>
+          <w:sz w:val="24"/>
+          <w:szCs w:val="24"/>
+          <w:lang w:val="en-US"/>
+        </w:rPr>
+        <w:t>et al.</w:t>
+      </w:r>
+      <w:r>
+        <w:rPr>
+          <w:rFonts w:ascii="CMU Serif" w:hAnsi="CMU Serif" w:cs="CMU Serif"/>
+          <w:sz w:val="24"/>
+          <w:szCs w:val="24"/>
+          <w:lang w:val="en-US"/>
+        </w:rPr>
+        <w:t xml:space="preserve"> (2023). The STRING database in 2023: Protein–protein association networks and functional enrichment analysis for any sequenced genome of interest. </w:t>
+      </w:r>
+      <w:r>
+        <w:rPr>
+          <w:rFonts w:ascii="CMU Serif" w:hAnsi="CMU Serif" w:cs="CMU Serif"/>
+          <w:i/>
+          <w:iCs/>
+          <w:sz w:val="24"/>
+          <w:szCs w:val="24"/>
+          <w:lang w:val="en-US"/>
+        </w:rPr>
+        <w:t>Nucleic Acids Research</w:t>
+      </w:r>
+      <w:r>
+        <w:rPr>
+          <w:rFonts w:ascii="CMU Serif" w:hAnsi="CMU Serif" w:cs="CMU Serif"/>
+          <w:sz w:val="24"/>
+          <w:szCs w:val="24"/>
+          <w:lang w:val="en-US"/>
+        </w:rPr>
+        <w:t xml:space="preserve">, 51(D1), D638–D646. </w:t>
+      </w:r>
+      <w:r>
+        <w:fldChar w:fldCharType="begin"/>
+      </w:r>
+      <w:r>
+        <w:rPr>
+          <w:lang w:val="en-US"/>
+        </w:rPr>
+        <w:instrText>HYPERLINK "https://doi.org/10.1093/nar/gkac1000"</w:instrText>
+      </w:r>
+      <w:r>
+        <w:fldChar w:fldCharType="separate"/>
+      </w:r>
+      <w:r>
+        <w:rPr>
+          <w:rStyle w:val="Hyperlink"/>
+          <w:rFonts w:ascii="CMU Serif" w:hAnsi="CMU Serif" w:cs="CMU Serif"/>
+          <w:sz w:val="24"/>
+          <w:szCs w:val="24"/>
+          <w:lang w:val="en-US"/>
+        </w:rPr>
+        <w:t>https://doi.org/10.1093/nar/gkac1000</w:t>
+      </w:r>
+      <w:r>
+        <w:fldChar w:fldCharType="end"/>
+      </w:r>
+    </w:p>
+    <w:p>
+      <w:pPr>
+        <w:rPr>
+          <w:rFonts w:ascii="CMU Serif" w:hAnsi="CMU Serif" w:cs="CMU Serif"/>
+          <w:sz w:val="24"/>
+          <w:szCs w:val="24"/>
+          <w:lang w:val="en-US"/>
+        </w:rPr>
+      </w:pPr>
+      <w:r>
+        <w:rPr>
+          <w:rFonts w:ascii="CMU Serif" w:hAnsi="CMU Serif" w:cs="CMU Serif"/>
+          <w:sz w:val="24"/>
+          <w:szCs w:val="24"/>
+          <w:lang w:val="en-US"/>
+        </w:rPr>
+        <w:lastRenderedPageBreak/>
+        <w:t xml:space="preserve">[14] The Gene Ontology Consortium. (2023). The Gene Ontology knowledgebase: 2023 update. </w:t>
+      </w:r>
+      <w:r>
+        <w:rPr>
+          <w:rFonts w:ascii="CMU Serif" w:hAnsi="CMU Serif" w:cs="CMU Serif"/>
+          <w:i/>
+          <w:iCs/>
+          <w:sz w:val="24"/>
+          <w:szCs w:val="24"/>
+          <w:lang w:val="en-US"/>
+        </w:rPr>
+        <w:t>Nucleic Acids Research</w:t>
+      </w:r>
+      <w:r>
+        <w:rPr>
+          <w:rFonts w:ascii="CMU Serif" w:hAnsi="CMU Serif" w:cs="CMU Serif"/>
+          <w:sz w:val="24"/>
+          <w:szCs w:val="24"/>
+          <w:lang w:val="en-US"/>
+        </w:rPr>
+        <w:t xml:space="preserve">, 51(D1), D849–D856. </w:t>
+      </w:r>
+      <w:r>
+        <w:fldChar w:fldCharType="begin"/>
+      </w:r>
+      <w:r>
+        <w:rPr>
+          <w:lang w:val="en-US"/>
+        </w:rPr>
+        <w:instrText>HYPERLINK "https://doi.org/10.1093/nar/gkac1011"</w:instrText>
+      </w:r>
+      <w:r>
+        <w:fldChar w:fldCharType="separate"/>
+      </w:r>
+      <w:r>
+        <w:rPr>
+          <w:rStyle w:val="Hyperlink"/>
+          <w:rFonts w:ascii="CMU Serif" w:hAnsi="CMU Serif" w:cs="CMU Serif"/>
+          <w:sz w:val="24"/>
+          <w:szCs w:val="24"/>
+          <w:lang w:val="en-US"/>
+        </w:rPr>
+        <w:t>https://doi.org/10.1093/nar/gkac1011</w:t>
+      </w:r>
+      <w:r>
+        <w:fldChar w:fldCharType="end"/>
+      </w:r>
+    </w:p>
+    <w:p>
+      <w:pPr>
+        <w:rPr>
+          <w:rFonts w:ascii="CMU Serif" w:hAnsi="CMU Serif" w:cs="CMU Serif"/>
+          <w:sz w:val="24"/>
+          <w:szCs w:val="24"/>
+          <w:lang w:val="en-US"/>
+        </w:rPr>
+      </w:pPr>
+      <w:r>
+        <w:rPr>
+          <w:rFonts w:ascii="CMU Serif" w:hAnsi="CMU Serif" w:cs="CMU Serif"/>
+          <w:sz w:val="24"/>
+          <w:szCs w:val="24"/>
+          <w:lang w:val="en-US"/>
+        </w:rPr>
+        <w:t xml:space="preserve">[15] Van Rossum, G., &amp; Drake, F. L. (2009). Python 3 Reference Manual. Python Software Foundation. </w:t>
+      </w:r>
+      <w:r>
+        <w:fldChar w:fldCharType="begin"/>
+      </w:r>
+      <w:r>
+        <w:rPr>
+          <w:lang w:val="en-US"/>
+        </w:rPr>
+        <w:instrText>HYPERLINK "https://docs.python.org/3/"</w:instrText>
+      </w:r>
+      <w:r>
+        <w:fldChar w:fldCharType="separate"/>
+      </w:r>
+      <w:r>
+        <w:rPr>
+          <w:rStyle w:val="Hyperlink"/>
+          <w:rFonts w:ascii="CMU Serif" w:hAnsi="CMU Serif" w:cs="CMU Serif"/>
+          <w:sz w:val="24"/>
+          <w:szCs w:val="24"/>
+          <w:lang w:val="en-US"/>
+        </w:rPr>
+        <w:t>https://docs.python.org/3/</w:t>
+      </w:r>
+      <w:r>
+        <w:fldChar w:fldCharType="end"/>
+      </w:r>
+    </w:p>
+    <w:p>
+      <w:pPr>
+        <w:rPr>
+          <w:rFonts w:ascii="CMU Serif" w:hAnsi="CMU Serif" w:cs="CMU Serif"/>
+          <w:sz w:val="24"/>
+          <w:szCs w:val="24"/>
+          <w:lang w:val="en-US"/>
+        </w:rPr>
+      </w:pPr>
+      <w:r>
+        <w:rPr>
+          <w:rFonts w:ascii="CMU Serif" w:hAnsi="CMU Serif" w:cs="CMU Serif"/>
+          <w:sz w:val="24"/>
+          <w:szCs w:val="24"/>
+          <w:lang w:val="en-US"/>
+        </w:rPr>
+        <w:t xml:space="preserve">[16] Hagberg, A. A., Schult, D. A., &amp; Swart, P. J. (2008). Exploring network structure, dynamics, and function using </w:t>
+      </w:r>
+      <w:proofErr w:type="spellStart"/>
+      <w:r>
+        <w:rPr>
+          <w:rFonts w:ascii="CMU Serif" w:hAnsi="CMU Serif" w:cs="CMU Serif"/>
+          <w:sz w:val="24"/>
+          <w:szCs w:val="24"/>
+          <w:lang w:val="en-US"/>
+        </w:rPr>
+        <w:t>NetworkX</w:t>
+      </w:r>
+      <w:proofErr w:type="spellEnd"/>
+      <w:r>
+        <w:rPr>
+          <w:rFonts w:ascii="CMU Serif" w:hAnsi="CMU Serif" w:cs="CMU Serif"/>
+          <w:sz w:val="24"/>
+          <w:szCs w:val="24"/>
+          <w:lang w:val="en-US"/>
+        </w:rPr>
+        <w:t xml:space="preserve">. </w:t>
+      </w:r>
+      <w:r>
+        <w:rPr>
+          <w:rFonts w:ascii="CMU Serif" w:hAnsi="CMU Serif" w:cs="CMU Serif"/>
+          <w:i/>
+          <w:iCs/>
+          <w:sz w:val="24"/>
+          <w:szCs w:val="24"/>
+          <w:lang w:val="en-US"/>
+        </w:rPr>
+        <w:t>Proceedings of the 7th Python in Science Conference</w:t>
+      </w:r>
+      <w:r>
+        <w:rPr>
+          <w:rFonts w:ascii="CMU Serif" w:hAnsi="CMU Serif" w:cs="CMU Serif"/>
+          <w:sz w:val="24"/>
+          <w:szCs w:val="24"/>
+          <w:lang w:val="en-US"/>
+        </w:rPr>
+        <w:t>, 11–15.</w:t>
+      </w:r>
+    </w:p>
+    <w:p>
+      <w:pPr>
+        <w:rPr>
+          <w:rFonts w:ascii="CMU Serif" w:hAnsi="CMU Serif" w:cs="CMU Serif"/>
+          <w:sz w:val="24"/>
+          <w:szCs w:val="24"/>
+          <w:lang w:val="en-US"/>
+        </w:rPr>
+      </w:pPr>
+      <w:r>
+        <w:rPr>
+          <w:rFonts w:ascii="CMU Serif" w:hAnsi="CMU Serif" w:cs="CMU Serif"/>
+          <w:sz w:val="24"/>
+          <w:szCs w:val="24"/>
+          <w:lang w:val="en-US"/>
+        </w:rPr>
+        <w:t xml:space="preserve">[17] World Health Organization. (2023). Dementia. </w:t>
+      </w:r>
       <w:hyperlink r:id="rId16" w:history="1">
+        <w:r>
+          <w:rPr>
+            <w:rStyle w:val="Hyperlink"/>
+            <w:rFonts w:ascii="CMU Serif" w:hAnsi="CMU Serif" w:cs="CMU Serif"/>
+            <w:sz w:val="24"/>
+            <w:szCs w:val="24"/>
+            <w:lang w:val="en-US"/>
+          </w:rPr>
+          <w:t>https://www.who.int/news-room/fact-sheets/detail/dementia</w:t>
+        </w:r>
+      </w:hyperlink>
+    </w:p>
+    <w:p>
+      <w:pPr>
+        <w:rPr>
+          <w:rFonts w:ascii="CMU Serif" w:hAnsi="CMU Serif" w:cs="CMU Serif"/>
+          <w:b/>
+          <w:bCs/>
+          <w:sz w:val="24"/>
+          <w:szCs w:val="24"/>
+          <w:lang w:val="en-US"/>
+        </w:rPr>
+      </w:pPr>
+      <w:r>
+        <w:rPr>
+          <w:rFonts w:ascii="CMU Serif" w:hAnsi="CMU Serif" w:cs="CMU Serif"/>
+          <w:sz w:val="24"/>
+          <w:szCs w:val="24"/>
+          <w:lang w:val="en-US"/>
+        </w:rPr>
+        <w:t>[18] Ellinidou</w:t>
+      </w:r>
+      <w:r>
+        <w:rPr>
+          <w:rFonts w:ascii="CMU Serif" w:hAnsi="CMU Serif" w:cs="CMU Serif"/>
+          <w:sz w:val="24"/>
+          <w:szCs w:val="24"/>
+          <w:lang w:val="en-US"/>
+        </w:rPr>
+        <w:t xml:space="preserve">, </w:t>
+      </w:r>
+      <w:r>
+        <w:rPr>
+          <w:rFonts w:ascii="CMU Serif" w:hAnsi="CMU Serif" w:cs="CMU Serif"/>
+          <w:sz w:val="24"/>
+          <w:szCs w:val="24"/>
+          <w:lang w:val="en-US"/>
+        </w:rPr>
+        <w:t>R</w:t>
+      </w:r>
+      <w:r>
+        <w:rPr>
+          <w:rFonts w:ascii="CMU Serif" w:hAnsi="CMU Serif" w:cs="CMU Serif"/>
+          <w:sz w:val="24"/>
+          <w:szCs w:val="24"/>
+          <w:lang w:val="en-US"/>
+        </w:rPr>
+        <w:t>. (202</w:t>
+      </w:r>
+      <w:r>
+        <w:rPr>
+          <w:rFonts w:ascii="CMU Serif" w:hAnsi="CMU Serif" w:cs="CMU Serif"/>
+          <w:sz w:val="24"/>
+          <w:szCs w:val="24"/>
+          <w:lang w:val="en-US"/>
+        </w:rPr>
+        <w:t>6</w:t>
+      </w:r>
+      <w:r>
+        <w:rPr>
+          <w:rFonts w:ascii="CMU Serif" w:hAnsi="CMU Serif" w:cs="CMU Serif"/>
+          <w:sz w:val="24"/>
+          <w:szCs w:val="24"/>
+          <w:lang w:val="en-US"/>
+        </w:rPr>
+        <w:t xml:space="preserve">). </w:t>
+      </w:r>
+      <w:r>
+        <w:rPr>
+          <w:rFonts w:ascii="CMU Serif" w:hAnsi="CMU Serif" w:cs="CMU Serif"/>
+          <w:i/>
+          <w:iCs/>
+          <w:sz w:val="24"/>
+          <w:szCs w:val="24"/>
+          <w:lang w:val="en-US"/>
+        </w:rPr>
+        <w:t>Integrated Transcriptomic Analysis of Alzheimer's Disease</w:t>
+      </w:r>
+      <w:r>
+        <w:rPr>
+          <w:rFonts w:ascii="CMU Serif" w:hAnsi="CMU Serif" w:cs="CMU Serif"/>
+          <w:sz w:val="24"/>
+          <w:szCs w:val="24"/>
+          <w:lang w:val="en-US"/>
+        </w:rPr>
+        <w:t xml:space="preserve">. </w:t>
+      </w:r>
+      <w:r>
+        <w:rPr>
+          <w:rFonts w:ascii="CMU Serif" w:hAnsi="CMU Serif" w:cs="CMU Serif"/>
+          <w:sz w:val="24"/>
+          <w:szCs w:val="24"/>
+          <w:lang w:val="en-US"/>
+        </w:rPr>
+        <w:t xml:space="preserve">GitHub. </w:t>
+      </w:r>
+      <w:hyperlink r:id="rId17" w:history="1">
         <w:r>
           <w:rPr>
             <w:rStyle w:val="Hyperlink"/>
@@ -8284,1374 +9821,19 @@
           <w:t>https://github.com/ritaell/alzheimers-transcriptomic-analysis</w:t>
         </w:r>
       </w:hyperlink>
-    </w:p>
-    <w:p>
-      <w:pPr>
-        <w:rPr>
-          <w:rFonts w:ascii="CMU Serif" w:hAnsi="CMU Serif" w:cs="CMU Serif"/>
-          <w:sz w:val="24"/>
-          <w:szCs w:val="24"/>
-          <w:lang w:val="en-US"/>
-        </w:rPr>
-      </w:pPr>
-      <w:hyperlink r:id="rId17" w:history="1">
-        <w:r>
-          <w:rPr>
-            <w:rStyle w:val="Hyperlink"/>
-            <w:rFonts w:ascii="CMU Serif" w:hAnsi="CMU Serif" w:cs="CMU Serif"/>
-            <w:sz w:val="24"/>
-            <w:szCs w:val="24"/>
-          </w:rPr>
-          <w:t> DOI: 10.5281/zenodo.21198586</w:t>
-        </w:r>
-      </w:hyperlink>
-    </w:p>
-    <w:p>
-      <w:pPr>
-        <w:rPr>
-          <w:rFonts w:ascii="CMU Serif" w:hAnsi="CMU Serif" w:cs="CMU Serif"/>
-          <w:sz w:val="24"/>
-          <w:szCs w:val="24"/>
-          <w:lang w:val="en-US"/>
-        </w:rPr>
-      </w:pPr>
-      <w:r>
-        <w:rPr>
-          <w:rFonts w:ascii="CMU Serif" w:hAnsi="CMU Serif" w:cs="CMU Serif"/>
-          <w:sz w:val="24"/>
-          <w:szCs w:val="24"/>
-          <w:lang w:val="en-US"/>
-        </w:rPr>
-        <w:t xml:space="preserve">[1] Ashburner, M., Ball, C. A., Blake, J. A., Botstein, D., Butler, H., Cherry, J. M., </w:t>
-      </w:r>
-      <w:r>
-        <w:rPr>
-          <w:rFonts w:ascii="CMU Serif" w:hAnsi="CMU Serif" w:cs="CMU Serif"/>
-          <w:i/>
-          <w:iCs/>
-          <w:sz w:val="24"/>
-          <w:szCs w:val="24"/>
-          <w:lang w:val="en-US"/>
-        </w:rPr>
-        <w:t>et al.</w:t>
-      </w:r>
-      <w:r>
-        <w:rPr>
-          <w:rFonts w:ascii="CMU Serif" w:hAnsi="CMU Serif" w:cs="CMU Serif"/>
-          <w:sz w:val="24"/>
-          <w:szCs w:val="24"/>
-          <w:lang w:val="en-US"/>
-        </w:rPr>
-        <w:t xml:space="preserve"> (2000). Gene ontology: Tool for the unification of biology. </w:t>
-      </w:r>
-      <w:r>
-        <w:rPr>
-          <w:rFonts w:ascii="CMU Serif" w:hAnsi="CMU Serif" w:cs="CMU Serif"/>
-          <w:i/>
-          <w:iCs/>
-          <w:sz w:val="24"/>
-          <w:szCs w:val="24"/>
-          <w:lang w:val="en-US"/>
-        </w:rPr>
-        <w:t>Nature Genetics</w:t>
-      </w:r>
-      <w:r>
-        <w:rPr>
-          <w:rFonts w:ascii="CMU Serif" w:hAnsi="CMU Serif" w:cs="CMU Serif"/>
-          <w:sz w:val="24"/>
-          <w:szCs w:val="24"/>
-          <w:lang w:val="en-US"/>
-        </w:rPr>
-        <w:t xml:space="preserve">, 25(1), 25–29. </w:t>
+      <w:r>
+        <w:rPr>
+          <w:lang w:val="en-US"/>
+        </w:rPr>
+        <w:t xml:space="preserve">, DOI: </w:t>
       </w:r>
       <w:hyperlink r:id="rId18" w:history="1">
-        <w:r>
-          <w:rPr>
-            <w:rStyle w:val="Hyperlink"/>
-            <w:rFonts w:ascii="CMU Serif" w:hAnsi="CMU Serif" w:cs="CMU Serif"/>
-            <w:sz w:val="24"/>
-            <w:szCs w:val="24"/>
-            <w:lang w:val="en-US"/>
-          </w:rPr>
-          <w:t>https://doi.org/10.1038/75556</w:t>
-        </w:r>
-      </w:hyperlink>
-    </w:p>
-    <w:p>
-      <w:pPr>
-        <w:rPr>
-          <w:rFonts w:ascii="CMU Serif" w:hAnsi="CMU Serif" w:cs="CMU Serif"/>
-          <w:sz w:val="24"/>
-          <w:szCs w:val="24"/>
-          <w:lang w:val="en-US"/>
-        </w:rPr>
-      </w:pPr>
-      <w:r>
-        <w:rPr>
-          <w:rFonts w:ascii="CMU Serif" w:hAnsi="CMU Serif" w:cs="CMU Serif"/>
-          <w:sz w:val="24"/>
-          <w:szCs w:val="24"/>
-          <w:lang w:val="en-US"/>
-        </w:rPr>
-        <w:t xml:space="preserve">[2] Benjamini, Y., &amp; Hochberg, Y. (1995). Controlling the false discovery rate: A practical and powerful approach to multiple testing. </w:t>
-      </w:r>
-      <w:r>
-        <w:rPr>
-          <w:rFonts w:ascii="CMU Serif" w:hAnsi="CMU Serif" w:cs="CMU Serif"/>
-          <w:i/>
-          <w:iCs/>
-          <w:sz w:val="24"/>
-          <w:szCs w:val="24"/>
-          <w:lang w:val="en-US"/>
-        </w:rPr>
-        <w:t>Journal of the Royal Statistical Society: Series B</w:t>
-      </w:r>
-      <w:r>
-        <w:rPr>
-          <w:rFonts w:ascii="CMU Serif" w:hAnsi="CMU Serif" w:cs="CMU Serif"/>
-          <w:sz w:val="24"/>
-          <w:szCs w:val="24"/>
-          <w:lang w:val="en-US"/>
-        </w:rPr>
-        <w:t xml:space="preserve">, 57(1), 289–300. </w:t>
-      </w:r>
-      <w:hyperlink r:id="rId19" w:history="1">
-        <w:r>
-          <w:rPr>
-            <w:rStyle w:val="Hyperlink"/>
-            <w:rFonts w:ascii="CMU Serif" w:hAnsi="CMU Serif" w:cs="CMU Serif"/>
-            <w:sz w:val="24"/>
-            <w:szCs w:val="24"/>
-            <w:lang w:val="en-US"/>
-          </w:rPr>
-          <w:t>https://www.jstor.org/stable/2346101</w:t>
-        </w:r>
-      </w:hyperlink>
-    </w:p>
-    <w:p>
-      <w:pPr>
-        <w:rPr>
-          <w:rFonts w:ascii="CMU Serif" w:hAnsi="CMU Serif" w:cs="CMU Serif"/>
-          <w:sz w:val="24"/>
-          <w:szCs w:val="24"/>
-          <w:lang w:val="en-US"/>
-        </w:rPr>
-      </w:pPr>
-      <w:r>
-        <w:rPr>
-          <w:rFonts w:ascii="CMU Serif" w:hAnsi="CMU Serif" w:cs="CMU Serif"/>
-          <w:sz w:val="24"/>
-          <w:szCs w:val="24"/>
-          <w:lang w:val="en-US"/>
-        </w:rPr>
-        <w:t xml:space="preserve">[3] Chen, E. Y., Tan, C. M., Kou, Y., Duan, Q., Wang, Z., Meirelles, G. V., </w:t>
-      </w:r>
-      <w:r>
-        <w:rPr>
-          <w:rFonts w:ascii="CMU Serif" w:hAnsi="CMU Serif" w:cs="CMU Serif"/>
-          <w:i/>
-          <w:iCs/>
-          <w:sz w:val="24"/>
-          <w:szCs w:val="24"/>
-          <w:lang w:val="en-US"/>
-        </w:rPr>
-        <w:t>et al.</w:t>
-      </w:r>
-      <w:r>
-        <w:rPr>
-          <w:rFonts w:ascii="CMU Serif" w:hAnsi="CMU Serif" w:cs="CMU Serif"/>
-          <w:sz w:val="24"/>
-          <w:szCs w:val="24"/>
-          <w:lang w:val="en-US"/>
-        </w:rPr>
-        <w:t xml:space="preserve"> (2013). </w:t>
-      </w:r>
-      <w:proofErr w:type="spellStart"/>
-      <w:r>
-        <w:rPr>
-          <w:rFonts w:ascii="CMU Serif" w:hAnsi="CMU Serif" w:cs="CMU Serif"/>
-          <w:sz w:val="24"/>
-          <w:szCs w:val="24"/>
-          <w:lang w:val="en-US"/>
-        </w:rPr>
-        <w:t>Enrichr</w:t>
-      </w:r>
-      <w:proofErr w:type="spellEnd"/>
-      <w:r>
-        <w:rPr>
-          <w:rFonts w:ascii="CMU Serif" w:hAnsi="CMU Serif" w:cs="CMU Serif"/>
-          <w:sz w:val="24"/>
-          <w:szCs w:val="24"/>
-          <w:lang w:val="en-US"/>
-        </w:rPr>
-        <w:t xml:space="preserve">: Interactive and collaborative HTML5 gene list enrichment analysis tool. </w:t>
-      </w:r>
-      <w:r>
-        <w:rPr>
-          <w:rFonts w:ascii="CMU Serif" w:hAnsi="CMU Serif" w:cs="CMU Serif"/>
-          <w:i/>
-          <w:iCs/>
-          <w:sz w:val="24"/>
-          <w:szCs w:val="24"/>
-          <w:lang w:val="en-US"/>
-        </w:rPr>
-        <w:t>BMC Bioinformatics</w:t>
-      </w:r>
-      <w:r>
-        <w:rPr>
-          <w:rFonts w:ascii="CMU Serif" w:hAnsi="CMU Serif" w:cs="CMU Serif"/>
-          <w:sz w:val="24"/>
-          <w:szCs w:val="24"/>
-          <w:lang w:val="en-US"/>
-        </w:rPr>
-        <w:t xml:space="preserve">, 14, 128. </w:t>
-      </w:r>
-      <w:hyperlink r:id="rId20" w:history="1">
-        <w:r>
-          <w:rPr>
-            <w:rStyle w:val="Hyperlink"/>
-            <w:rFonts w:ascii="CMU Serif" w:hAnsi="CMU Serif" w:cs="CMU Serif"/>
-            <w:sz w:val="24"/>
-            <w:szCs w:val="24"/>
-            <w:lang w:val="en-US"/>
-          </w:rPr>
-          <w:t>https://doi.org/10.1186/1471-2105-14-128</w:t>
-        </w:r>
-      </w:hyperlink>
-    </w:p>
-    <w:p>
-      <w:pPr>
-        <w:rPr>
-          <w:rFonts w:ascii="CMU Serif" w:hAnsi="CMU Serif" w:cs="CMU Serif"/>
-          <w:sz w:val="24"/>
-          <w:szCs w:val="24"/>
-          <w:lang w:val="en-US"/>
-        </w:rPr>
-      </w:pPr>
-      <w:r>
-        <w:rPr>
-          <w:rFonts w:ascii="CMU Serif" w:hAnsi="CMU Serif" w:cs="CMU Serif"/>
-          <w:sz w:val="24"/>
-          <w:szCs w:val="24"/>
-          <w:lang w:val="en-US"/>
-        </w:rPr>
-        <w:lastRenderedPageBreak/>
-        <w:t xml:space="preserve">[4] Edgar, R., Domrachev, M., &amp; Lash, A. E. (2002). Gene Expression Omnibus: NCBI gene expression and hybridization array data repository. </w:t>
-      </w:r>
-      <w:r>
-        <w:rPr>
-          <w:rFonts w:ascii="CMU Serif" w:hAnsi="CMU Serif" w:cs="CMU Serif"/>
-          <w:i/>
-          <w:iCs/>
-          <w:sz w:val="24"/>
-          <w:szCs w:val="24"/>
-          <w:lang w:val="en-US"/>
-        </w:rPr>
-        <w:t>Nucleic Acids Research</w:t>
-      </w:r>
-      <w:r>
-        <w:rPr>
-          <w:rFonts w:ascii="CMU Serif" w:hAnsi="CMU Serif" w:cs="CMU Serif"/>
-          <w:sz w:val="24"/>
-          <w:szCs w:val="24"/>
-          <w:lang w:val="en-US"/>
-        </w:rPr>
-        <w:t xml:space="preserve">, 30(1), 207–210. </w:t>
-      </w:r>
-      <w:hyperlink r:id="rId21" w:history="1">
-        <w:r>
-          <w:rPr>
-            <w:rStyle w:val="Hyperlink"/>
-            <w:rFonts w:ascii="CMU Serif" w:hAnsi="CMU Serif" w:cs="CMU Serif"/>
-            <w:sz w:val="24"/>
-            <w:szCs w:val="24"/>
-            <w:lang w:val="en-US"/>
-          </w:rPr>
-          <w:t>https://doi.org/10.1093/nar/30.1.207</w:t>
-        </w:r>
-      </w:hyperlink>
-    </w:p>
-    <w:p>
-      <w:pPr>
-        <w:rPr>
-          <w:rFonts w:ascii="CMU Serif" w:hAnsi="CMU Serif" w:cs="CMU Serif"/>
-          <w:sz w:val="24"/>
-          <w:szCs w:val="24"/>
-          <w:lang w:val="en-US"/>
-        </w:rPr>
-      </w:pPr>
-      <w:r>
-        <w:rPr>
-          <w:rFonts w:ascii="CMU Serif" w:hAnsi="CMU Serif" w:cs="CMU Serif"/>
-          <w:sz w:val="24"/>
-          <w:szCs w:val="24"/>
-          <w:lang w:val="en-US"/>
-        </w:rPr>
-        <w:t xml:space="preserve">[5] Fang, Z., Liu, X., &amp; Peltz, G. (2023). </w:t>
-      </w:r>
-      <w:proofErr w:type="spellStart"/>
-      <w:r>
-        <w:rPr>
-          <w:rFonts w:ascii="CMU Serif" w:hAnsi="CMU Serif" w:cs="CMU Serif"/>
-          <w:sz w:val="24"/>
-          <w:szCs w:val="24"/>
-          <w:lang w:val="en-US"/>
-        </w:rPr>
-        <w:t>GSEApy</w:t>
-      </w:r>
-      <w:proofErr w:type="spellEnd"/>
-      <w:r>
-        <w:rPr>
-          <w:rFonts w:ascii="CMU Serif" w:hAnsi="CMU Serif" w:cs="CMU Serif"/>
-          <w:sz w:val="24"/>
-          <w:szCs w:val="24"/>
-          <w:lang w:val="en-US"/>
-        </w:rPr>
-        <w:t xml:space="preserve">: A comprehensive package for performing gene set enrichment analysis in Python. </w:t>
-      </w:r>
-      <w:r>
-        <w:rPr>
-          <w:rFonts w:ascii="CMU Serif" w:hAnsi="CMU Serif" w:cs="CMU Serif"/>
-          <w:i/>
-          <w:iCs/>
-          <w:sz w:val="24"/>
-          <w:szCs w:val="24"/>
-          <w:lang w:val="en-US"/>
-        </w:rPr>
-        <w:t>Bioinformatics</w:t>
-      </w:r>
-      <w:r>
-        <w:rPr>
-          <w:rFonts w:ascii="CMU Serif" w:hAnsi="CMU Serif" w:cs="CMU Serif"/>
-          <w:sz w:val="24"/>
-          <w:szCs w:val="24"/>
-          <w:lang w:val="en-US"/>
-        </w:rPr>
-        <w:t xml:space="preserve">, 39(1). </w:t>
-      </w:r>
-      <w:hyperlink r:id="rId22" w:history="1">
-        <w:r>
-          <w:rPr>
-            <w:rStyle w:val="Hyperlink"/>
-            <w:rFonts w:ascii="CMU Serif" w:hAnsi="CMU Serif" w:cs="CMU Serif"/>
-            <w:sz w:val="24"/>
-            <w:szCs w:val="24"/>
-            <w:lang w:val="en-US"/>
-          </w:rPr>
-          <w:t>https://doi.org/10.1093/bioinformatics/btac757</w:t>
-        </w:r>
-      </w:hyperlink>
-    </w:p>
-    <w:p>
-      <w:pPr>
-        <w:rPr>
-          <w:rFonts w:ascii="CMU Serif" w:hAnsi="CMU Serif" w:cs="CMU Serif"/>
-          <w:sz w:val="24"/>
-          <w:szCs w:val="24"/>
-          <w:lang w:val="en-US"/>
-        </w:rPr>
-      </w:pPr>
-      <w:r>
-        <w:rPr>
-          <w:rFonts w:ascii="CMU Serif" w:hAnsi="CMU Serif" w:cs="CMU Serif"/>
-          <w:sz w:val="24"/>
-          <w:szCs w:val="24"/>
-          <w:lang w:val="en-US"/>
-        </w:rPr>
-        <w:t xml:space="preserve">[6] </w:t>
-      </w:r>
-      <w:proofErr w:type="spellStart"/>
-      <w:r>
-        <w:rPr>
-          <w:rFonts w:ascii="CMU Serif" w:hAnsi="CMU Serif" w:cs="CMU Serif"/>
-          <w:sz w:val="24"/>
-          <w:szCs w:val="24"/>
-          <w:lang w:val="en-US"/>
-        </w:rPr>
-        <w:t>Kanehisa</w:t>
-      </w:r>
-      <w:proofErr w:type="spellEnd"/>
-      <w:r>
-        <w:rPr>
-          <w:rFonts w:ascii="CMU Serif" w:hAnsi="CMU Serif" w:cs="CMU Serif"/>
-          <w:sz w:val="24"/>
-          <w:szCs w:val="24"/>
-          <w:lang w:val="en-US"/>
-        </w:rPr>
-        <w:t xml:space="preserve">, M., </w:t>
-      </w:r>
-      <w:proofErr w:type="spellStart"/>
-      <w:r>
-        <w:rPr>
-          <w:rFonts w:ascii="CMU Serif" w:hAnsi="CMU Serif" w:cs="CMU Serif"/>
-          <w:sz w:val="24"/>
-          <w:szCs w:val="24"/>
-          <w:lang w:val="en-US"/>
-        </w:rPr>
-        <w:t>Furumichi</w:t>
-      </w:r>
-      <w:proofErr w:type="spellEnd"/>
-      <w:r>
-        <w:rPr>
-          <w:rFonts w:ascii="CMU Serif" w:hAnsi="CMU Serif" w:cs="CMU Serif"/>
-          <w:sz w:val="24"/>
-          <w:szCs w:val="24"/>
-          <w:lang w:val="en-US"/>
-        </w:rPr>
-        <w:t xml:space="preserve">, M., Sato, Y., Kawashima, M., &amp; Ishiguro-Watanabe, M. (2023). KEGG for taxonomy-based analysis of pathways and genomes. </w:t>
-      </w:r>
-      <w:r>
-        <w:rPr>
-          <w:rFonts w:ascii="CMU Serif" w:hAnsi="CMU Serif" w:cs="CMU Serif"/>
-          <w:i/>
-          <w:iCs/>
-          <w:sz w:val="24"/>
-          <w:szCs w:val="24"/>
-          <w:lang w:val="en-US"/>
-        </w:rPr>
-        <w:t>Nucleic Acids Research</w:t>
-      </w:r>
-      <w:r>
-        <w:rPr>
-          <w:rFonts w:ascii="CMU Serif" w:hAnsi="CMU Serif" w:cs="CMU Serif"/>
-          <w:sz w:val="24"/>
-          <w:szCs w:val="24"/>
-          <w:lang w:val="en-US"/>
-        </w:rPr>
-        <w:t xml:space="preserve">, 51(D1), D587–D592. </w:t>
-      </w:r>
-      <w:hyperlink r:id="rId23" w:history="1">
-        <w:r>
-          <w:rPr>
-            <w:rStyle w:val="Hyperlink"/>
-            <w:rFonts w:ascii="CMU Serif" w:hAnsi="CMU Serif" w:cs="CMU Serif"/>
-            <w:sz w:val="24"/>
-            <w:szCs w:val="24"/>
-            <w:lang w:val="en-US"/>
-          </w:rPr>
-          <w:t>https://doi.org/10.1093/nar/gkac963</w:t>
-        </w:r>
-      </w:hyperlink>
-    </w:p>
-    <w:p>
-      <w:pPr>
-        <w:rPr>
-          <w:rFonts w:ascii="CMU Serif" w:hAnsi="CMU Serif" w:cs="CMU Serif"/>
-          <w:sz w:val="24"/>
-          <w:szCs w:val="24"/>
-          <w:lang w:val="en-US"/>
-        </w:rPr>
-      </w:pPr>
-      <w:r>
-        <w:rPr>
-          <w:rFonts w:ascii="CMU Serif" w:hAnsi="CMU Serif" w:cs="CMU Serif"/>
-          <w:sz w:val="24"/>
-          <w:szCs w:val="24"/>
-          <w:lang w:val="en-US"/>
-        </w:rPr>
-        <w:t xml:space="preserve">[7] </w:t>
-      </w:r>
-      <w:proofErr w:type="spellStart"/>
-      <w:r>
-        <w:rPr>
-          <w:rFonts w:ascii="CMU Serif" w:hAnsi="CMU Serif" w:cs="CMU Serif"/>
-          <w:sz w:val="24"/>
-          <w:szCs w:val="24"/>
-          <w:lang w:val="en-US"/>
-        </w:rPr>
-        <w:t>McKhann</w:t>
-      </w:r>
-      <w:proofErr w:type="spellEnd"/>
-      <w:r>
-        <w:rPr>
-          <w:rFonts w:ascii="CMU Serif" w:hAnsi="CMU Serif" w:cs="CMU Serif"/>
-          <w:sz w:val="24"/>
-          <w:szCs w:val="24"/>
-          <w:lang w:val="en-US"/>
-        </w:rPr>
-        <w:t xml:space="preserve">, G. M., </w:t>
-      </w:r>
-      <w:proofErr w:type="spellStart"/>
-      <w:r>
-        <w:rPr>
-          <w:rFonts w:ascii="CMU Serif" w:hAnsi="CMU Serif" w:cs="CMU Serif"/>
-          <w:sz w:val="24"/>
-          <w:szCs w:val="24"/>
-          <w:lang w:val="en-US"/>
-        </w:rPr>
-        <w:t>Knopman</w:t>
-      </w:r>
-      <w:proofErr w:type="spellEnd"/>
-      <w:r>
-        <w:rPr>
-          <w:rFonts w:ascii="CMU Serif" w:hAnsi="CMU Serif" w:cs="CMU Serif"/>
-          <w:sz w:val="24"/>
-          <w:szCs w:val="24"/>
-          <w:lang w:val="en-US"/>
-        </w:rPr>
-        <w:t xml:space="preserve">, D. S., </w:t>
-      </w:r>
-      <w:proofErr w:type="spellStart"/>
-      <w:r>
-        <w:rPr>
-          <w:rFonts w:ascii="CMU Serif" w:hAnsi="CMU Serif" w:cs="CMU Serif"/>
-          <w:sz w:val="24"/>
-          <w:szCs w:val="24"/>
-          <w:lang w:val="en-US"/>
-        </w:rPr>
-        <w:t>Chertkow</w:t>
-      </w:r>
-      <w:proofErr w:type="spellEnd"/>
-      <w:r>
-        <w:rPr>
-          <w:rFonts w:ascii="CMU Serif" w:hAnsi="CMU Serif" w:cs="CMU Serif"/>
-          <w:sz w:val="24"/>
-          <w:szCs w:val="24"/>
-          <w:lang w:val="en-US"/>
-        </w:rPr>
-        <w:t xml:space="preserve">, H., Hyman, B. T., Jack, C. R., Kawas, C. H., </w:t>
-      </w:r>
-      <w:r>
-        <w:rPr>
-          <w:rFonts w:ascii="CMU Serif" w:hAnsi="CMU Serif" w:cs="CMU Serif"/>
-          <w:i/>
-          <w:iCs/>
-          <w:sz w:val="24"/>
-          <w:szCs w:val="24"/>
-          <w:lang w:val="en-US"/>
-        </w:rPr>
-        <w:t>et al.</w:t>
-      </w:r>
-      <w:r>
-        <w:rPr>
-          <w:rFonts w:ascii="CMU Serif" w:hAnsi="CMU Serif" w:cs="CMU Serif"/>
-          <w:sz w:val="24"/>
-          <w:szCs w:val="24"/>
-          <w:lang w:val="en-US"/>
-        </w:rPr>
-        <w:t xml:space="preserve"> (2011). The diagnosis of dementia due to Alzheimer's disease: Recommendations from the National Institute on Aging–Alzheimer's Association workgroups. </w:t>
-      </w:r>
-      <w:r>
-        <w:rPr>
-          <w:rFonts w:ascii="CMU Serif" w:hAnsi="CMU Serif" w:cs="CMU Serif"/>
-          <w:i/>
-          <w:iCs/>
-          <w:sz w:val="24"/>
-          <w:szCs w:val="24"/>
-          <w:lang w:val="en-US"/>
-        </w:rPr>
-        <w:t>Alzheimer's &amp; Dementia</w:t>
-      </w:r>
-      <w:r>
-        <w:rPr>
-          <w:rFonts w:ascii="CMU Serif" w:hAnsi="CMU Serif" w:cs="CMU Serif"/>
-          <w:sz w:val="24"/>
-          <w:szCs w:val="24"/>
-          <w:lang w:val="en-US"/>
-        </w:rPr>
-        <w:t xml:space="preserve">, 7(3), 263–269. </w:t>
-      </w:r>
-      <w:hyperlink r:id="rId24" w:history="1">
-        <w:r>
-          <w:rPr>
-            <w:rStyle w:val="Hyperlink"/>
-            <w:rFonts w:ascii="CMU Serif" w:hAnsi="CMU Serif" w:cs="CMU Serif"/>
-            <w:sz w:val="24"/>
-            <w:szCs w:val="24"/>
-            <w:lang w:val="en-US"/>
-          </w:rPr>
-          <w:t>https://doi.org/10.1016/j.jalz.2011.03.005</w:t>
-        </w:r>
-      </w:hyperlink>
-    </w:p>
-    <w:p>
-      <w:pPr>
-        <w:rPr>
-          <w:rFonts w:ascii="CMU Serif" w:hAnsi="CMU Serif" w:cs="CMU Serif"/>
-          <w:sz w:val="24"/>
-          <w:szCs w:val="24"/>
-          <w:lang w:val="en-US"/>
-        </w:rPr>
-      </w:pPr>
-      <w:r>
-        <w:rPr>
-          <w:rFonts w:ascii="CMU Serif" w:hAnsi="CMU Serif" w:cs="CMU Serif"/>
-          <w:sz w:val="24"/>
-          <w:szCs w:val="24"/>
-          <w:lang w:val="en-US"/>
-        </w:rPr>
-        <w:t xml:space="preserve">[8] McKinney, W. (2010). Data structures for statistical computing in Python. </w:t>
-      </w:r>
-      <w:r>
-        <w:rPr>
-          <w:rFonts w:ascii="CMU Serif" w:hAnsi="CMU Serif" w:cs="CMU Serif"/>
-          <w:i/>
-          <w:iCs/>
-          <w:sz w:val="24"/>
-          <w:szCs w:val="24"/>
-          <w:lang w:val="en-US"/>
-        </w:rPr>
-        <w:t>Proceedings of the 9th Python in Science Conference</w:t>
-      </w:r>
-      <w:r>
-        <w:rPr>
-          <w:rFonts w:ascii="CMU Serif" w:hAnsi="CMU Serif" w:cs="CMU Serif"/>
-          <w:sz w:val="24"/>
-          <w:szCs w:val="24"/>
-          <w:lang w:val="en-US"/>
-        </w:rPr>
-        <w:t>, 51–56.</w:t>
-      </w:r>
-    </w:p>
-    <w:p>
-      <w:pPr>
-        <w:rPr>
-          <w:rFonts w:ascii="CMU Serif" w:hAnsi="CMU Serif" w:cs="CMU Serif"/>
-          <w:sz w:val="24"/>
-          <w:szCs w:val="24"/>
-          <w:lang w:val="en-US"/>
-        </w:rPr>
-      </w:pPr>
-      <w:r>
-        <w:rPr>
-          <w:rFonts w:ascii="CMU Serif" w:hAnsi="CMU Serif" w:cs="CMU Serif"/>
-          <w:sz w:val="24"/>
-          <w:szCs w:val="24"/>
-          <w:lang w:val="en-US"/>
-        </w:rPr>
-        <w:t xml:space="preserve">[9] Narayanan, M., Huynh, J. L., Wang, K., Yang, X., Yoo, S., McElwee, J., </w:t>
-      </w:r>
-      <w:r>
-        <w:rPr>
-          <w:rFonts w:ascii="CMU Serif" w:hAnsi="CMU Serif" w:cs="CMU Serif"/>
-          <w:i/>
-          <w:iCs/>
-          <w:sz w:val="24"/>
-          <w:szCs w:val="24"/>
-          <w:lang w:val="en-US"/>
-        </w:rPr>
-        <w:t>et al.</w:t>
-      </w:r>
-      <w:r>
-        <w:rPr>
-          <w:rFonts w:ascii="CMU Serif" w:hAnsi="CMU Serif" w:cs="CMU Serif"/>
-          <w:sz w:val="24"/>
-          <w:szCs w:val="24"/>
-          <w:lang w:val="en-US"/>
-        </w:rPr>
-        <w:t xml:space="preserve"> (2014). Common dysregulation network in the human prefrontal cortex underlies two neurodegenerative diseases. </w:t>
-      </w:r>
-      <w:r>
-        <w:rPr>
-          <w:rFonts w:ascii="CMU Serif" w:hAnsi="CMU Serif" w:cs="CMU Serif"/>
-          <w:i/>
-          <w:iCs/>
-          <w:sz w:val="24"/>
-          <w:szCs w:val="24"/>
-          <w:lang w:val="en-US"/>
-        </w:rPr>
-        <w:t>Molecular Systems Biology</w:t>
-      </w:r>
-      <w:r>
-        <w:rPr>
-          <w:rFonts w:ascii="CMU Serif" w:hAnsi="CMU Serif" w:cs="CMU Serif"/>
-          <w:sz w:val="24"/>
-          <w:szCs w:val="24"/>
-          <w:lang w:val="en-US"/>
-        </w:rPr>
-        <w:t xml:space="preserve">, 10, 743. </w:t>
-      </w:r>
-      <w:hyperlink r:id="rId25" w:history="1">
-        <w:r>
-          <w:rPr>
-            <w:rStyle w:val="Hyperlink"/>
-            <w:rFonts w:ascii="CMU Serif" w:hAnsi="CMU Serif" w:cs="CMU Serif"/>
-            <w:sz w:val="24"/>
-            <w:szCs w:val="24"/>
-            <w:lang w:val="en-US"/>
-          </w:rPr>
-          <w:t>https://doi.org/10.15252/msb.20145304</w:t>
-        </w:r>
-      </w:hyperlink>
-    </w:p>
-    <w:p>
-      <w:pPr>
-        <w:rPr>
-          <w:rFonts w:ascii="CMU Serif" w:hAnsi="CMU Serif" w:cs="CMU Serif"/>
-          <w:sz w:val="24"/>
-          <w:szCs w:val="24"/>
-          <w:lang w:val="en-US"/>
-        </w:rPr>
-      </w:pPr>
-      <w:r>
-        <w:rPr>
-          <w:rFonts w:ascii="CMU Serif" w:hAnsi="CMU Serif" w:cs="CMU Serif"/>
-          <w:sz w:val="24"/>
-          <w:szCs w:val="24"/>
-          <w:lang w:val="en-US"/>
-        </w:rPr>
-        <w:t xml:space="preserve">[10] Pedregosa, F., </w:t>
-      </w:r>
-      <w:proofErr w:type="spellStart"/>
-      <w:r>
-        <w:rPr>
-          <w:rFonts w:ascii="CMU Serif" w:hAnsi="CMU Serif" w:cs="CMU Serif"/>
-          <w:sz w:val="24"/>
-          <w:szCs w:val="24"/>
-          <w:lang w:val="en-US"/>
-        </w:rPr>
-        <w:t>Varoquaux</w:t>
-      </w:r>
-      <w:proofErr w:type="spellEnd"/>
-      <w:r>
-        <w:rPr>
-          <w:rFonts w:ascii="CMU Serif" w:hAnsi="CMU Serif" w:cs="CMU Serif"/>
-          <w:sz w:val="24"/>
-          <w:szCs w:val="24"/>
-          <w:lang w:val="en-US"/>
-        </w:rPr>
-        <w:t xml:space="preserve">, G., </w:t>
-      </w:r>
-      <w:proofErr w:type="spellStart"/>
-      <w:r>
-        <w:rPr>
-          <w:rFonts w:ascii="CMU Serif" w:hAnsi="CMU Serif" w:cs="CMU Serif"/>
-          <w:sz w:val="24"/>
-          <w:szCs w:val="24"/>
-          <w:lang w:val="en-US"/>
-        </w:rPr>
-        <w:t>Gramfort</w:t>
-      </w:r>
-      <w:proofErr w:type="spellEnd"/>
-      <w:r>
-        <w:rPr>
-          <w:rFonts w:ascii="CMU Serif" w:hAnsi="CMU Serif" w:cs="CMU Serif"/>
-          <w:sz w:val="24"/>
-          <w:szCs w:val="24"/>
-          <w:lang w:val="en-US"/>
-        </w:rPr>
-        <w:t xml:space="preserve">, A., Michel, V., Thirion, B., Grisel, O., </w:t>
-      </w:r>
-      <w:r>
-        <w:rPr>
-          <w:rFonts w:ascii="CMU Serif" w:hAnsi="CMU Serif" w:cs="CMU Serif"/>
-          <w:i/>
-          <w:iCs/>
-          <w:sz w:val="24"/>
-          <w:szCs w:val="24"/>
-          <w:lang w:val="en-US"/>
-        </w:rPr>
-        <w:t>et al.</w:t>
-      </w:r>
-      <w:r>
-        <w:rPr>
-          <w:rFonts w:ascii="CMU Serif" w:hAnsi="CMU Serif" w:cs="CMU Serif"/>
-          <w:sz w:val="24"/>
-          <w:szCs w:val="24"/>
-          <w:lang w:val="en-US"/>
-        </w:rPr>
-        <w:t xml:space="preserve"> (2011). Scikit-learn: Machine learning in Python. </w:t>
-      </w:r>
-      <w:r>
-        <w:rPr>
-          <w:rFonts w:ascii="CMU Serif" w:hAnsi="CMU Serif" w:cs="CMU Serif"/>
-          <w:i/>
-          <w:iCs/>
-          <w:sz w:val="24"/>
-          <w:szCs w:val="24"/>
-          <w:lang w:val="en-US"/>
-        </w:rPr>
-        <w:t>Journal of Machine Learning Research</w:t>
-      </w:r>
-      <w:r>
-        <w:rPr>
-          <w:rFonts w:ascii="CMU Serif" w:hAnsi="CMU Serif" w:cs="CMU Serif"/>
-          <w:sz w:val="24"/>
-          <w:szCs w:val="24"/>
-          <w:lang w:val="en-US"/>
-        </w:rPr>
-        <w:t>, 12, 2825–2830.</w:t>
-      </w:r>
-    </w:p>
-    <w:p>
-      <w:pPr>
-        <w:rPr>
-          <w:rFonts w:ascii="CMU Serif" w:hAnsi="CMU Serif" w:cs="CMU Serif"/>
-          <w:sz w:val="24"/>
-          <w:szCs w:val="24"/>
-          <w:lang w:val="en-US"/>
-        </w:rPr>
-      </w:pPr>
-      <w:r>
-        <w:rPr>
-          <w:rFonts w:ascii="CMU Serif" w:hAnsi="CMU Serif" w:cs="CMU Serif"/>
-          <w:sz w:val="24"/>
-          <w:szCs w:val="24"/>
-          <w:lang w:val="en-US"/>
-        </w:rPr>
-        <w:t xml:space="preserve">[11] Ritchie, M. E., </w:t>
-      </w:r>
-      <w:proofErr w:type="spellStart"/>
-      <w:r>
-        <w:rPr>
-          <w:rFonts w:ascii="CMU Serif" w:hAnsi="CMU Serif" w:cs="CMU Serif"/>
-          <w:sz w:val="24"/>
-          <w:szCs w:val="24"/>
-          <w:lang w:val="en-US"/>
-        </w:rPr>
-        <w:t>Phipson</w:t>
-      </w:r>
-      <w:proofErr w:type="spellEnd"/>
-      <w:r>
-        <w:rPr>
-          <w:rFonts w:ascii="CMU Serif" w:hAnsi="CMU Serif" w:cs="CMU Serif"/>
-          <w:sz w:val="24"/>
-          <w:szCs w:val="24"/>
-          <w:lang w:val="en-US"/>
-        </w:rPr>
-        <w:t xml:space="preserve">, B., Wu, D., Hu, Y., Law, C. W., Shi, W., &amp; Smyth, G. K. (2015). </w:t>
-      </w:r>
-      <w:proofErr w:type="spellStart"/>
-      <w:r>
-        <w:rPr>
-          <w:rFonts w:ascii="CMU Serif" w:hAnsi="CMU Serif" w:cs="CMU Serif"/>
-          <w:sz w:val="24"/>
-          <w:szCs w:val="24"/>
-          <w:lang w:val="en-US"/>
-        </w:rPr>
-        <w:t>limma</w:t>
-      </w:r>
-      <w:proofErr w:type="spellEnd"/>
-      <w:r>
-        <w:rPr>
-          <w:rFonts w:ascii="CMU Serif" w:hAnsi="CMU Serif" w:cs="CMU Serif"/>
-          <w:sz w:val="24"/>
-          <w:szCs w:val="24"/>
-          <w:lang w:val="en-US"/>
-        </w:rPr>
-        <w:t xml:space="preserve"> powers differential expression analyses for RNA-sequencing and microarray studies. </w:t>
-      </w:r>
-      <w:r>
-        <w:rPr>
-          <w:rFonts w:ascii="CMU Serif" w:hAnsi="CMU Serif" w:cs="CMU Serif"/>
-          <w:i/>
-          <w:iCs/>
-          <w:sz w:val="24"/>
-          <w:szCs w:val="24"/>
-          <w:lang w:val="en-US"/>
-        </w:rPr>
-        <w:t>Nucleic Acids Research</w:t>
-      </w:r>
-      <w:r>
-        <w:rPr>
-          <w:rFonts w:ascii="CMU Serif" w:hAnsi="CMU Serif" w:cs="CMU Serif"/>
-          <w:sz w:val="24"/>
-          <w:szCs w:val="24"/>
-          <w:lang w:val="en-US"/>
-        </w:rPr>
-        <w:t xml:space="preserve">, 43(7), e47. </w:t>
-      </w:r>
-      <w:hyperlink r:id="rId26" w:history="1">
-        <w:r>
-          <w:rPr>
-            <w:rStyle w:val="Hyperlink"/>
-            <w:rFonts w:ascii="CMU Serif" w:hAnsi="CMU Serif" w:cs="CMU Serif"/>
-            <w:sz w:val="24"/>
-            <w:szCs w:val="24"/>
-            <w:lang w:val="en-US"/>
-          </w:rPr>
-          <w:t>https://doi.org/10.1093/nar/gkv007</w:t>
-        </w:r>
-      </w:hyperlink>
-    </w:p>
-    <w:p>
-      <w:pPr>
-        <w:rPr>
-          <w:rFonts w:ascii="CMU Serif" w:hAnsi="CMU Serif" w:cs="CMU Serif"/>
-          <w:sz w:val="24"/>
-          <w:szCs w:val="24"/>
-          <w:lang w:val="en-US"/>
-        </w:rPr>
-      </w:pPr>
-      <w:r>
-        <w:rPr>
-          <w:rFonts w:ascii="CMU Serif" w:hAnsi="CMU Serif" w:cs="CMU Serif"/>
-          <w:sz w:val="24"/>
-          <w:szCs w:val="24"/>
-          <w:lang w:val="en-US"/>
-        </w:rPr>
-        <w:t xml:space="preserve">[12] Smyth, G. K. (2004). Linear models and empirical Bayes methods for assessing differential expression in microarray experiments. </w:t>
-      </w:r>
-      <w:r>
-        <w:rPr>
-          <w:rFonts w:ascii="CMU Serif" w:hAnsi="CMU Serif" w:cs="CMU Serif"/>
-          <w:i/>
-          <w:iCs/>
-          <w:sz w:val="24"/>
-          <w:szCs w:val="24"/>
-          <w:lang w:val="en-US"/>
-        </w:rPr>
-        <w:t>Statistical Applications in Genetics and Molecular Biology</w:t>
-      </w:r>
-      <w:r>
-        <w:rPr>
-          <w:rFonts w:ascii="CMU Serif" w:hAnsi="CMU Serif" w:cs="CMU Serif"/>
-          <w:sz w:val="24"/>
-          <w:szCs w:val="24"/>
-          <w:lang w:val="en-US"/>
-        </w:rPr>
-        <w:t xml:space="preserve">, 3(1). </w:t>
-      </w:r>
-      <w:hyperlink r:id="rId27" w:history="1">
-        <w:r>
-          <w:rPr>
-            <w:rStyle w:val="Hyperlink"/>
-            <w:rFonts w:ascii="CMU Serif" w:hAnsi="CMU Serif" w:cs="CMU Serif"/>
-            <w:sz w:val="24"/>
-            <w:szCs w:val="24"/>
-            <w:lang w:val="en-US"/>
-          </w:rPr>
-          <w:t>https://doi.org/10.2202/1544-6115.1027</w:t>
-        </w:r>
-      </w:hyperlink>
-    </w:p>
-    <w:p>
-      <w:pPr>
-        <w:rPr>
-          <w:rFonts w:ascii="CMU Serif" w:hAnsi="CMU Serif" w:cs="CMU Serif"/>
-          <w:sz w:val="24"/>
-          <w:szCs w:val="24"/>
-          <w:lang w:val="en-US"/>
-        </w:rPr>
-      </w:pPr>
-      <w:r>
-        <w:rPr>
-          <w:rFonts w:ascii="CMU Serif" w:hAnsi="CMU Serif" w:cs="CMU Serif"/>
-          <w:sz w:val="24"/>
-          <w:szCs w:val="24"/>
-          <w:lang w:val="en-US"/>
-        </w:rPr>
-        <w:t xml:space="preserve">[13] </w:t>
-      </w:r>
-      <w:proofErr w:type="spellStart"/>
-      <w:r>
-        <w:rPr>
-          <w:rFonts w:ascii="CMU Serif" w:hAnsi="CMU Serif" w:cs="CMU Serif"/>
-          <w:sz w:val="24"/>
-          <w:szCs w:val="24"/>
-          <w:lang w:val="en-US"/>
-        </w:rPr>
-        <w:t>Szklarczyk</w:t>
-      </w:r>
-      <w:proofErr w:type="spellEnd"/>
-      <w:r>
-        <w:rPr>
-          <w:rFonts w:ascii="CMU Serif" w:hAnsi="CMU Serif" w:cs="CMU Serif"/>
-          <w:sz w:val="24"/>
-          <w:szCs w:val="24"/>
-          <w:lang w:val="en-US"/>
-        </w:rPr>
-        <w:t xml:space="preserve">, D., Gable, A. L., </w:t>
-      </w:r>
-      <w:proofErr w:type="spellStart"/>
-      <w:r>
-        <w:rPr>
-          <w:rFonts w:ascii="CMU Serif" w:hAnsi="CMU Serif" w:cs="CMU Serif"/>
-          <w:sz w:val="24"/>
-          <w:szCs w:val="24"/>
-          <w:lang w:val="en-US"/>
-        </w:rPr>
-        <w:t>Nastou</w:t>
-      </w:r>
-      <w:proofErr w:type="spellEnd"/>
-      <w:r>
-        <w:rPr>
-          <w:rFonts w:ascii="CMU Serif" w:hAnsi="CMU Serif" w:cs="CMU Serif"/>
-          <w:sz w:val="24"/>
-          <w:szCs w:val="24"/>
-          <w:lang w:val="en-US"/>
-        </w:rPr>
-        <w:t xml:space="preserve">, K. C., Lyon, D., Kirsch, R., </w:t>
-      </w:r>
-      <w:proofErr w:type="spellStart"/>
-      <w:r>
-        <w:rPr>
-          <w:rFonts w:ascii="CMU Serif" w:hAnsi="CMU Serif" w:cs="CMU Serif"/>
-          <w:sz w:val="24"/>
-          <w:szCs w:val="24"/>
-          <w:lang w:val="en-US"/>
-        </w:rPr>
-        <w:t>Pyysalo</w:t>
-      </w:r>
-      <w:proofErr w:type="spellEnd"/>
-      <w:r>
-        <w:rPr>
-          <w:rFonts w:ascii="CMU Serif" w:hAnsi="CMU Serif" w:cs="CMU Serif"/>
-          <w:sz w:val="24"/>
-          <w:szCs w:val="24"/>
-          <w:lang w:val="en-US"/>
-        </w:rPr>
-        <w:t xml:space="preserve">, S., </w:t>
-      </w:r>
-      <w:r>
-        <w:rPr>
-          <w:rFonts w:ascii="CMU Serif" w:hAnsi="CMU Serif" w:cs="CMU Serif"/>
-          <w:i/>
-          <w:iCs/>
-          <w:sz w:val="24"/>
-          <w:szCs w:val="24"/>
-          <w:lang w:val="en-US"/>
-        </w:rPr>
-        <w:t>et al.</w:t>
-      </w:r>
-      <w:r>
-        <w:rPr>
-          <w:rFonts w:ascii="CMU Serif" w:hAnsi="CMU Serif" w:cs="CMU Serif"/>
-          <w:sz w:val="24"/>
-          <w:szCs w:val="24"/>
-          <w:lang w:val="en-US"/>
-        </w:rPr>
-        <w:t xml:space="preserve"> (2023). The STRING database in 2023: Protein–protein association networks and functional enrichment analysis for any sequenced genome of interest. </w:t>
-      </w:r>
-      <w:r>
-        <w:rPr>
-          <w:rFonts w:ascii="CMU Serif" w:hAnsi="CMU Serif" w:cs="CMU Serif"/>
-          <w:i/>
-          <w:iCs/>
-          <w:sz w:val="24"/>
-          <w:szCs w:val="24"/>
-          <w:lang w:val="en-US"/>
-        </w:rPr>
-        <w:t>Nucleic Acids Research</w:t>
-      </w:r>
-      <w:r>
-        <w:rPr>
-          <w:rFonts w:ascii="CMU Serif" w:hAnsi="CMU Serif" w:cs="CMU Serif"/>
-          <w:sz w:val="24"/>
-          <w:szCs w:val="24"/>
-          <w:lang w:val="en-US"/>
-        </w:rPr>
-        <w:t xml:space="preserve">, 51(D1), D638–D646. </w:t>
-      </w:r>
-      <w:hyperlink r:id="rId28" w:history="1">
-        <w:r>
-          <w:rPr>
-            <w:rStyle w:val="Hyperlink"/>
-            <w:rFonts w:ascii="CMU Serif" w:hAnsi="CMU Serif" w:cs="CMU Serif"/>
-            <w:sz w:val="24"/>
-            <w:szCs w:val="24"/>
-            <w:lang w:val="en-US"/>
-          </w:rPr>
-          <w:t>https://doi.org/10.1093/nar/gkac1000</w:t>
-        </w:r>
-      </w:hyperlink>
-    </w:p>
-    <w:p>
-      <w:pPr>
-        <w:rPr>
-          <w:rFonts w:ascii="CMU Serif" w:hAnsi="CMU Serif" w:cs="CMU Serif"/>
-          <w:sz w:val="24"/>
-          <w:szCs w:val="24"/>
-          <w:lang w:val="en-US"/>
-        </w:rPr>
-      </w:pPr>
-      <w:r>
-        <w:rPr>
-          <w:rFonts w:ascii="CMU Serif" w:hAnsi="CMU Serif" w:cs="CMU Serif"/>
-          <w:sz w:val="24"/>
-          <w:szCs w:val="24"/>
-          <w:lang w:val="en-US"/>
-        </w:rPr>
-        <w:lastRenderedPageBreak/>
-        <w:t xml:space="preserve">[14] The Gene Ontology Consortium. (2023). The Gene Ontology knowledgebase: 2023 update. </w:t>
-      </w:r>
-      <w:r>
-        <w:rPr>
-          <w:rFonts w:ascii="CMU Serif" w:hAnsi="CMU Serif" w:cs="CMU Serif"/>
-          <w:i/>
-          <w:iCs/>
-          <w:sz w:val="24"/>
-          <w:szCs w:val="24"/>
-          <w:lang w:val="en-US"/>
-        </w:rPr>
-        <w:t>Nucleic Acids Research</w:t>
-      </w:r>
-      <w:r>
-        <w:rPr>
-          <w:rFonts w:ascii="CMU Serif" w:hAnsi="CMU Serif" w:cs="CMU Serif"/>
-          <w:sz w:val="24"/>
-          <w:szCs w:val="24"/>
-          <w:lang w:val="en-US"/>
-        </w:rPr>
-        <w:t xml:space="preserve">, 51(D1), D849–D856. </w:t>
-      </w:r>
-      <w:hyperlink r:id="rId29" w:history="1">
-        <w:r>
-          <w:rPr>
-            <w:rStyle w:val="Hyperlink"/>
-            <w:rFonts w:ascii="CMU Serif" w:hAnsi="CMU Serif" w:cs="CMU Serif"/>
-            <w:sz w:val="24"/>
-            <w:szCs w:val="24"/>
-            <w:lang w:val="en-US"/>
-          </w:rPr>
-          <w:t>https://doi.org/10.1093/nar/gkac1011</w:t>
-        </w:r>
-      </w:hyperlink>
-    </w:p>
-    <w:p>
-      <w:pPr>
-        <w:rPr>
-          <w:rFonts w:ascii="CMU Serif" w:hAnsi="CMU Serif" w:cs="CMU Serif"/>
-          <w:sz w:val="24"/>
-          <w:szCs w:val="24"/>
-          <w:lang w:val="en-US"/>
-        </w:rPr>
-      </w:pPr>
-      <w:r>
-        <w:rPr>
-          <w:rFonts w:ascii="CMU Serif" w:hAnsi="CMU Serif" w:cs="CMU Serif"/>
-          <w:sz w:val="24"/>
-          <w:szCs w:val="24"/>
-          <w:lang w:val="en-US"/>
-        </w:rPr>
-        <w:t xml:space="preserve">[15] Van Rossum, G., &amp; Drake, F. L. (2009). Python 3 Reference Manual. Python Software Foundation. </w:t>
-      </w:r>
-      <w:hyperlink r:id="rId30" w:history="1">
-        <w:r>
-          <w:rPr>
-            <w:rStyle w:val="Hyperlink"/>
-            <w:rFonts w:ascii="CMU Serif" w:hAnsi="CMU Serif" w:cs="CMU Serif"/>
-            <w:sz w:val="24"/>
-            <w:szCs w:val="24"/>
-            <w:lang w:val="en-US"/>
-          </w:rPr>
-          <w:t>https://docs.python.org/3/</w:t>
-        </w:r>
-      </w:hyperlink>
-    </w:p>
-    <w:p>
-      <w:pPr>
-        <w:rPr>
-          <w:rFonts w:ascii="CMU Serif" w:hAnsi="CMU Serif" w:cs="CMU Serif"/>
-          <w:sz w:val="24"/>
-          <w:szCs w:val="24"/>
-          <w:lang w:val="en-US"/>
-        </w:rPr>
-      </w:pPr>
-      <w:r>
-        <w:rPr>
-          <w:rFonts w:ascii="CMU Serif" w:hAnsi="CMU Serif" w:cs="CMU Serif"/>
-          <w:sz w:val="24"/>
-          <w:szCs w:val="24"/>
-          <w:lang w:val="en-US"/>
-        </w:rPr>
-        <w:t xml:space="preserve">[16] Hagberg, A. A., Schult, D. A., &amp; Swart, P. J. (2008). Exploring network structure, dynamics, and function using </w:t>
-      </w:r>
-      <w:proofErr w:type="spellStart"/>
-      <w:r>
-        <w:rPr>
-          <w:rFonts w:ascii="CMU Serif" w:hAnsi="CMU Serif" w:cs="CMU Serif"/>
-          <w:sz w:val="24"/>
-          <w:szCs w:val="24"/>
-          <w:lang w:val="en-US"/>
-        </w:rPr>
-        <w:t>NetworkX</w:t>
-      </w:r>
-      <w:proofErr w:type="spellEnd"/>
-      <w:r>
-        <w:rPr>
-          <w:rFonts w:ascii="CMU Serif" w:hAnsi="CMU Serif" w:cs="CMU Serif"/>
-          <w:sz w:val="24"/>
-          <w:szCs w:val="24"/>
-          <w:lang w:val="en-US"/>
-        </w:rPr>
-        <w:t xml:space="preserve">. </w:t>
-      </w:r>
-      <w:r>
-        <w:rPr>
-          <w:rFonts w:ascii="CMU Serif" w:hAnsi="CMU Serif" w:cs="CMU Serif"/>
-          <w:i/>
-          <w:iCs/>
-          <w:sz w:val="24"/>
-          <w:szCs w:val="24"/>
-          <w:lang w:val="en-US"/>
-        </w:rPr>
-        <w:t>Proceedings of the 7th Python in Science Conference</w:t>
-      </w:r>
-      <w:r>
-        <w:rPr>
-          <w:rFonts w:ascii="CMU Serif" w:hAnsi="CMU Serif" w:cs="CMU Serif"/>
-          <w:sz w:val="24"/>
-          <w:szCs w:val="24"/>
-          <w:lang w:val="en-US"/>
-        </w:rPr>
-        <w:t>, 11–15.</w:t>
-      </w:r>
-    </w:p>
-    <w:p>
-      <w:pPr>
-        <w:rPr>
-          <w:rFonts w:ascii="CMU Serif" w:hAnsi="CMU Serif" w:cs="CMU Serif"/>
-          <w:sz w:val="24"/>
-          <w:szCs w:val="24"/>
-          <w:lang w:val="en-US"/>
-        </w:rPr>
-      </w:pPr>
-      <w:r>
-        <w:rPr>
-          <w:rFonts w:ascii="CMU Serif" w:hAnsi="CMU Serif" w:cs="CMU Serif"/>
-          <w:sz w:val="24"/>
-          <w:szCs w:val="24"/>
-          <w:lang w:val="en-US"/>
-        </w:rPr>
-        <w:t xml:space="preserve">[17] World Health Organization. (2023). Dementia. </w:t>
-      </w:r>
-      <w:hyperlink r:id="rId31" w:history="1">
-        <w:r>
-          <w:rPr>
-            <w:rStyle w:val="Hyperlink"/>
-            <w:rFonts w:ascii="CMU Serif" w:hAnsi="CMU Serif" w:cs="CMU Serif"/>
-            <w:sz w:val="24"/>
-            <w:szCs w:val="24"/>
-            <w:lang w:val="en-US"/>
-          </w:rPr>
-          <w:t>https://www.who.int/news-room/fact-sheets/detail/dementia</w:t>
-        </w:r>
-      </w:hyperlink>
-    </w:p>
-    <w:p>
-      <w:pPr>
-        <w:rPr>
-          <w:rFonts w:ascii="CMU Serif" w:hAnsi="CMU Serif" w:cs="CMU Serif"/>
-          <w:b/>
-          <w:bCs/>
-          <w:sz w:val="24"/>
-          <w:szCs w:val="24"/>
-          <w:lang w:val="en-US"/>
-        </w:rPr>
-      </w:pPr>
-      <w:r>
-        <w:rPr>
-          <w:rFonts w:ascii="CMU Serif" w:hAnsi="CMU Serif" w:cs="CMU Serif"/>
-          <w:sz w:val="24"/>
-          <w:szCs w:val="24"/>
-          <w:lang w:val="en-US"/>
-        </w:rPr>
-        <w:t>[18] Ellinidou</w:t>
-      </w:r>
-      <w:r>
-        <w:rPr>
-          <w:rFonts w:ascii="CMU Serif" w:hAnsi="CMU Serif" w:cs="CMU Serif"/>
-          <w:sz w:val="24"/>
-          <w:szCs w:val="24"/>
-          <w:lang w:val="en-US"/>
-        </w:rPr>
-        <w:t xml:space="preserve">, </w:t>
-      </w:r>
-      <w:r>
-        <w:rPr>
-          <w:rFonts w:ascii="CMU Serif" w:hAnsi="CMU Serif" w:cs="CMU Serif"/>
-          <w:sz w:val="24"/>
-          <w:szCs w:val="24"/>
-          <w:lang w:val="en-US"/>
-        </w:rPr>
-        <w:t>R</w:t>
-      </w:r>
-      <w:r>
-        <w:rPr>
-          <w:rFonts w:ascii="CMU Serif" w:hAnsi="CMU Serif" w:cs="CMU Serif"/>
-          <w:sz w:val="24"/>
-          <w:szCs w:val="24"/>
-          <w:lang w:val="en-US"/>
-        </w:rPr>
-        <w:t>. (202</w:t>
-      </w:r>
-      <w:r>
-        <w:rPr>
-          <w:rFonts w:ascii="CMU Serif" w:hAnsi="CMU Serif" w:cs="CMU Serif"/>
-          <w:sz w:val="24"/>
-          <w:szCs w:val="24"/>
-          <w:lang w:val="en-US"/>
-        </w:rPr>
-        <w:t>6</w:t>
-      </w:r>
-      <w:r>
-        <w:rPr>
-          <w:rFonts w:ascii="CMU Serif" w:hAnsi="CMU Serif" w:cs="CMU Serif"/>
-          <w:sz w:val="24"/>
-          <w:szCs w:val="24"/>
-          <w:lang w:val="en-US"/>
-        </w:rPr>
-        <w:t xml:space="preserve">). </w:t>
-      </w:r>
-      <w:r>
-        <w:rPr>
-          <w:rFonts w:ascii="CMU Serif" w:hAnsi="CMU Serif" w:cs="CMU Serif"/>
-          <w:i/>
-          <w:iCs/>
-          <w:sz w:val="24"/>
-          <w:szCs w:val="24"/>
-          <w:lang w:val="en-US"/>
-        </w:rPr>
-        <w:t>Integrated Transcriptomic Analysis of Alzheimer's Disease</w:t>
-      </w:r>
-      <w:r>
-        <w:rPr>
-          <w:rFonts w:ascii="CMU Serif" w:hAnsi="CMU Serif" w:cs="CMU Serif"/>
-          <w:sz w:val="24"/>
-          <w:szCs w:val="24"/>
-          <w:lang w:val="en-US"/>
-        </w:rPr>
-        <w:t xml:space="preserve">. </w:t>
-      </w:r>
-      <w:r>
-        <w:rPr>
-          <w:rFonts w:ascii="CMU Serif" w:hAnsi="CMU Serif" w:cs="CMU Serif"/>
-          <w:sz w:val="24"/>
-          <w:szCs w:val="24"/>
-          <w:lang w:val="en-US"/>
-        </w:rPr>
-        <w:t xml:space="preserve">GitHub. </w:t>
-      </w:r>
-      <w:hyperlink r:id="rId32" w:history="1">
-        <w:r>
-          <w:rPr>
-            <w:rStyle w:val="Hyperlink"/>
-            <w:rFonts w:ascii="CMU Serif" w:hAnsi="CMU Serif" w:cs="CMU Serif"/>
-            <w:sz w:val="24"/>
-            <w:szCs w:val="24"/>
-            <w:lang w:val="en-US"/>
-          </w:rPr>
-          <w:t>https://github.com/ritaell/alzheimers-transcriptomic-analysis</w:t>
-        </w:r>
-      </w:hyperlink>
-      <w:r>
-        <w:rPr>
-          <w:lang w:val="en-US"/>
-        </w:rPr>
-        <w:t xml:space="preserve">, DOI: </w:t>
-      </w:r>
-      <w:hyperlink r:id="rId33" w:history="1">
         <w:r>
           <w:rPr>
             <w:rStyle w:val="Hyperlink"/>
             <w:lang w:val="en-US"/>
           </w:rPr>
-          <w:t> D</w:t>
-        </w:r>
-        <w:r>
-          <w:rPr>
-            <w:rStyle w:val="Hyperlink"/>
-            <w:lang w:val="en-US"/>
-          </w:rPr>
-          <w:t>O</w:t>
-        </w:r>
-        <w:r>
-          <w:rPr>
-            <w:rStyle w:val="Hyperlink"/>
-            <w:lang w:val="en-US"/>
-          </w:rPr>
-          <w:t>I: 10.5281/zenodo.21198586</w:t>
+          <w:t> DOI: 10.5281/zenodo.21198586</w:t>
         </w:r>
       </w:hyperlink>
     </w:p>
@@ -11196,6 +11378,7 @@
   <w:style w:type="character" w:default="1" w:styleId="DefaultParagraphFont">
     <w:name w:val="Default Paragraph Font"/>
     <w:uiPriority w:val="1"/>
+    <w:semiHidden/>
     <w:unhideWhenUsed/>
   </w:style>
   <w:style w:type="table" w:default="1" w:styleId="TableNormal">

</xml_diff>